<commit_message>
Add structured reflection sections to report template, update hero image
- Add "Reflection on Round 1" to Round 2 sections (Song A & B): strengths,
  weaknesses, and prompt revision reasoning with change/add/delete table
- Add "Reflection on Rounds 1 and 2" to Round 3 sections (Song A & B):
  strengths, remaining weaknesses, strategy effectiveness assessment,
  and prompt revision reasoning table
- Update README hero image to 2026spr version
- Regenerate .docx from updated template

Co-Authored-By: Claude Opus 4.6 (1M context) <noreply@anthropic.com>
</commit_message>
<xml_diff>
--- a/docs/final_report_template.docx
+++ b/docs/final_report_template.docx
@@ -2,7 +2,7 @@
 <file path=word/document.xml><?xml version="1.0" encoding="utf-8"?>
 <w:document xmlns:w="http://schemas.openxmlformats.org/wordprocessingml/2006/main" xmlns:m="http://schemas.openxmlformats.org/officeDocument/2006/math" xmlns:r="http://schemas.openxmlformats.org/officeDocument/2006/relationships" xmlns:o="urn:schemas-microsoft-com:office:office" xmlns:v="urn:schemas-microsoft-com:vml" xmlns:w10="urn:schemas-microsoft-com:office:word" xmlns:a="http://schemas.openxmlformats.org/drawingml/2006/main" xmlns:pic="http://schemas.openxmlformats.org/drawingml/2006/picture" xmlns:wp="http://schemas.openxmlformats.org/drawingml/2006/wordprocessingDrawing">
   <w:body>
-    <w:bookmarkStart w:id="42" w:name="mini-project-3-final-report"/>
+    <w:bookmarkStart w:id="50" w:name="mini-project-3-final-report"/>
     <w:p>
       <w:pPr>
         <w:pStyle w:val="Heading1"/>
@@ -807,7 +807,7 @@
     </w:p>
     <w:bookmarkEnd w:id="18"/>
     <w:bookmarkEnd w:id="19"/>
-    <w:bookmarkStart w:id="27" w:name="song-a-rounds-1-3"/>
+    <w:bookmarkStart w:id="31" w:name="song-a-rounds-1-3"/>
     <w:p>
       <w:pPr>
         <w:pStyle w:val="Heading2"/>
@@ -2973,13 +2973,263 @@
     </w:p>
     <w:bookmarkEnd w:id="20"/>
     <w:bookmarkEnd w:id="21"/>
-    <w:bookmarkStart w:id="23" w:name="song-a-round-2-targeted-refinement"/>
+    <w:bookmarkStart w:id="25" w:name="song-a-round-2-targeted-refinement"/>
     <w:p>
       <w:pPr>
         <w:pStyle w:val="Heading3"/>
       </w:pPr>
       <w:r>
         <w:t xml:space="preserve">Song A — Round 2 (Targeted Refinement)</w:t>
+      </w:r>
+    </w:p>
+    <w:bookmarkStart w:id="22" w:name="reflection-on-round-1"/>
+    <w:p>
+      <w:pPr>
+        <w:pStyle w:val="Heading4"/>
+      </w:pPr>
+      <w:r>
+        <w:t xml:space="preserve">Reflection on Round 1</w:t>
+      </w:r>
+    </w:p>
+    <w:p>
+      <w:pPr>
+        <w:pStyle w:val="FirstParagraph"/>
+      </w:pPr>
+      <w:r>
+        <w:rPr>
+          <w:b/>
+          <w:bCs/>
+        </w:rPr>
+        <w:t xml:space="preserve">Strengths from Round 1</w:t>
+      </w:r>
+      <w:r>
+        <w:t xml:space="preserve"> </w:t>
+      </w:r>
+      <w:r>
+        <w:rPr>
+          <w:i/>
+          <w:iCs/>
+        </w:rPr>
+        <w:t xml:space="preserve">(What worked well? Which rubric categories scored highest and why?):</w:t>
+      </w:r>
+    </w:p>
+    <w:p>
+      <w:r>
+        <w:pict>
+          <v:rect style="width:0;height:1.5pt" o:hralign="center" o:hrstd="t" o:hr="t"/>
+        </w:pict>
+      </w:r>
+    </w:p>
+    <w:p>
+      <w:pPr>
+        <w:pStyle w:val="FirstParagraph"/>
+      </w:pPr>
+      <w:r>
+        <w:rPr>
+          <w:b/>
+          <w:bCs/>
+        </w:rPr>
+        <w:t xml:space="preserve">Weaknesses from Round 1</w:t>
+      </w:r>
+      <w:r>
+        <w:t xml:space="preserve"> </w:t>
+      </w:r>
+      <w:r>
+        <w:rPr>
+          <w:i/>
+          <w:iCs/>
+        </w:rPr>
+        <w:t xml:space="preserve">(What fell short? Which rubric categories scored lowest and why?):</w:t>
+      </w:r>
+    </w:p>
+    <w:p>
+      <w:r>
+        <w:pict>
+          <v:rect style="width:0;height:1.5pt" o:hralign="center" o:hrstd="t" o:hr="t"/>
+        </w:pict>
+      </w:r>
+    </w:p>
+    <w:bookmarkEnd w:id="22"/>
+    <w:bookmarkStart w:id="23" w:name="prompt-revision-reasoning"/>
+    <w:p>
+      <w:pPr>
+        <w:pStyle w:val="Heading4"/>
+      </w:pPr>
+      <w:r>
+        <w:t xml:space="preserve">Prompt Revision Reasoning</w:t>
+      </w:r>
+    </w:p>
+    <w:p>
+      <w:pPr>
+        <w:pStyle w:val="FirstParagraph"/>
+      </w:pPr>
+      <w:r>
+        <w:rPr>
+          <w:b/>
+          <w:bCs/>
+        </w:rPr>
+        <w:t xml:space="preserve">Specific prompt elements you changed, added, or deleted:</w:t>
+      </w:r>
+    </w:p>
+    <w:tbl>
+      <w:tblPr>
+        <w:tblStyle w:val="Table"/>
+        <w:tblW w:type="pct" w:w="5000"/>
+        <w:tblLayout w:type="fixed"/>
+        <w:tblLook w:firstRow="1" w:lastRow="0" w:firstColumn="0" w:lastColumn="0" w:noHBand="0" w:noVBand="0" w:val="0020"/>
+      </w:tblPr>
+      <w:tblGrid>
+        <w:gridCol w:w="1240"/>
+        <w:gridCol w:w="2958"/>
+        <w:gridCol w:w="3721"/>
+      </w:tblGrid>
+      <w:tr>
+        <w:trPr>
+          <w:tblHeader w:val="on"/>
+        </w:trPr>
+        <w:tc>
+          <w:tcPr/>
+          <w:p>
+            <w:pPr>
+              <w:pStyle w:val="Compact"/>
+              <w:jc w:val="center"/>
+            </w:pPr>
+            <w:r>
+              <w:t xml:space="preserve">Change Type</w:t>
+            </w:r>
+          </w:p>
+        </w:tc>
+        <w:tc>
+          <w:tcPr/>
+          <w:p>
+            <w:pPr>
+              <w:pStyle w:val="Compact"/>
+            </w:pPr>
+            <w:r>
+              <w:t xml:space="preserve">What You Changed in the Prompt</w:t>
+            </w:r>
+          </w:p>
+        </w:tc>
+        <w:tc>
+          <w:tcPr/>
+          <w:p>
+            <w:pPr>
+              <w:pStyle w:val="Compact"/>
+            </w:pPr>
+            <w:r>
+              <w:t xml:space="preserve">Which Strength/Weakness This Addresses</w:t>
+            </w:r>
+          </w:p>
+        </w:tc>
+      </w:tr>
+      <w:tr>
+        <w:tc>
+          <w:tcPr/>
+          <w:p>
+            <w:pPr>
+              <w:pStyle w:val="Compact"/>
+              <w:jc w:val="center"/>
+            </w:pPr>
+            <w:r>
+              <w:t xml:space="preserve">Changed</w:t>
+            </w:r>
+          </w:p>
+        </w:tc>
+        <w:tc>
+          <w:tcPr/>
+          <w:p>
+            <w:pPr>
+              <w:pStyle w:val="Compact"/>
+            </w:pPr>
+          </w:p>
+        </w:tc>
+        <w:tc>
+          <w:tcPr/>
+          <w:p>
+            <w:pPr>
+              <w:pStyle w:val="Compact"/>
+            </w:pPr>
+          </w:p>
+        </w:tc>
+      </w:tr>
+      <w:tr>
+        <w:tc>
+          <w:tcPr/>
+          <w:p>
+            <w:pPr>
+              <w:pStyle w:val="Compact"/>
+              <w:jc w:val="center"/>
+            </w:pPr>
+            <w:r>
+              <w:t xml:space="preserve">Added</w:t>
+            </w:r>
+          </w:p>
+        </w:tc>
+        <w:tc>
+          <w:tcPr/>
+          <w:p>
+            <w:pPr>
+              <w:pStyle w:val="Compact"/>
+            </w:pPr>
+          </w:p>
+        </w:tc>
+        <w:tc>
+          <w:tcPr/>
+          <w:p>
+            <w:pPr>
+              <w:pStyle w:val="Compact"/>
+            </w:pPr>
+          </w:p>
+        </w:tc>
+      </w:tr>
+      <w:tr>
+        <w:tc>
+          <w:tcPr/>
+          <w:p>
+            <w:pPr>
+              <w:pStyle w:val="Compact"/>
+              <w:jc w:val="center"/>
+            </w:pPr>
+            <w:r>
+              <w:t xml:space="preserve">Deleted</w:t>
+            </w:r>
+          </w:p>
+        </w:tc>
+        <w:tc>
+          <w:tcPr/>
+          <w:p>
+            <w:pPr>
+              <w:pStyle w:val="Compact"/>
+            </w:pPr>
+          </w:p>
+        </w:tc>
+        <w:tc>
+          <w:tcPr/>
+          <w:p>
+            <w:pPr>
+              <w:pStyle w:val="Compact"/>
+            </w:pPr>
+          </w:p>
+        </w:tc>
+      </w:tr>
+    </w:tbl>
+    <w:p>
+      <w:pPr>
+        <w:pStyle w:val="BodyText"/>
+      </w:pPr>
+      <w:r>
+        <w:rPr>
+          <w:b/>
+          <w:bCs/>
+        </w:rPr>
+        <w:t xml:space="preserve">Why you believe these changes will improve the output:</w:t>
+      </w:r>
+    </w:p>
+    <w:p>
+      <w:r>
+        <w:pict>
+          <v:rect style="width:0;height:1.5pt" o:hralign="center" o:hrstd="t" o:hr="t"/>
+        </w:pict>
       </w:r>
     </w:p>
     <w:p>
@@ -3024,25 +3274,6 @@
           <w:b/>
           <w:bCs/>
         </w:rPr>
-        <w:t xml:space="preserve">What You Changed and Why:</w:t>
-      </w:r>
-    </w:p>
-    <w:p>
-      <w:r>
-        <w:pict>
-          <v:rect style="width:0;height:1.5pt" o:hralign="center" o:hrstd="t" o:hr="t"/>
-        </w:pict>
-      </w:r>
-    </w:p>
-    <w:p>
-      <w:pPr>
-        <w:pStyle w:val="FirstParagraph"/>
-      </w:pPr>
-      <w:r>
-        <w:rPr>
-          <w:b/>
-          <w:bCs/>
-        </w:rPr>
         <w:t xml:space="preserve">Refinement Strategy Used</w:t>
       </w:r>
       <w:r>
@@ -3125,7 +3356,8 @@
         <w:t xml:space="preserve">SongA_Round2.mp3</w:t>
       </w:r>
     </w:p>
-    <w:bookmarkStart w:id="22" w:name="harmonic-rubric-song-a-round-2"/>
+    <w:bookmarkEnd w:id="23"/>
+    <w:bookmarkStart w:id="24" w:name="harmonic-rubric-song-a-round-2"/>
     <w:p>
       <w:pPr>
         <w:pStyle w:val="Heading4"/>
@@ -5236,15 +5468,294 @@
         </w:pict>
       </w:r>
     </w:p>
-    <w:bookmarkEnd w:id="22"/>
-    <w:bookmarkEnd w:id="23"/>
-    <w:bookmarkStart w:id="25" w:name="song-a-round-3-fine-tuning"/>
+    <w:bookmarkEnd w:id="24"/>
+    <w:bookmarkEnd w:id="25"/>
+    <w:bookmarkStart w:id="29" w:name="song-a-round-3-fine-tuning"/>
     <w:p>
       <w:pPr>
         <w:pStyle w:val="Heading3"/>
       </w:pPr>
       <w:r>
         <w:t xml:space="preserve">Song A — Round 3 (Fine-Tuning)</w:t>
+      </w:r>
+    </w:p>
+    <w:bookmarkStart w:id="26" w:name="reflection-on-rounds-1-and-2"/>
+    <w:p>
+      <w:pPr>
+        <w:pStyle w:val="Heading4"/>
+      </w:pPr>
+      <w:r>
+        <w:t xml:space="preserve">Reflection on Rounds 1 and 2</w:t>
+      </w:r>
+    </w:p>
+    <w:p>
+      <w:pPr>
+        <w:pStyle w:val="FirstParagraph"/>
+      </w:pPr>
+      <w:r>
+        <w:rPr>
+          <w:b/>
+          <w:bCs/>
+        </w:rPr>
+        <w:t xml:space="preserve">Strengths from Round 2</w:t>
+      </w:r>
+      <w:r>
+        <w:t xml:space="preserve"> </w:t>
+      </w:r>
+      <w:r>
+        <w:rPr>
+          <w:i/>
+          <w:iCs/>
+        </w:rPr>
+        <w:t xml:space="preserve">(What improved from Round 1? What new strengths emerged?):</w:t>
+      </w:r>
+    </w:p>
+    <w:p>
+      <w:r>
+        <w:pict>
+          <v:rect style="width:0;height:1.5pt" o:hralign="center" o:hrstd="t" o:hr="t"/>
+        </w:pict>
+      </w:r>
+    </w:p>
+    <w:p>
+      <w:pPr>
+        <w:pStyle w:val="FirstParagraph"/>
+      </w:pPr>
+      <w:r>
+        <w:rPr>
+          <w:b/>
+          <w:bCs/>
+        </w:rPr>
+        <w:t xml:space="preserve">Remaining weaknesses</w:t>
+      </w:r>
+      <w:r>
+        <w:t xml:space="preserve"> </w:t>
+      </w:r>
+      <w:r>
+        <w:rPr>
+          <w:i/>
+          <w:iCs/>
+        </w:rPr>
+        <w:t xml:space="preserve">(What issues persisted or appeared despite Round 2 refinements?):</w:t>
+      </w:r>
+    </w:p>
+    <w:p>
+      <w:r>
+        <w:pict>
+          <v:rect style="width:0;height:1.5pt" o:hralign="center" o:hrstd="t" o:hr="t"/>
+        </w:pict>
+      </w:r>
+    </w:p>
+    <w:p>
+      <w:pPr>
+        <w:pStyle w:val="FirstParagraph"/>
+      </w:pPr>
+      <w:r>
+        <w:rPr>
+          <w:b/>
+          <w:bCs/>
+        </w:rPr>
+        <w:t xml:space="preserve">Assessment of Round 2 refinement strategy</w:t>
+      </w:r>
+      <w:r>
+        <w:t xml:space="preserve"> </w:t>
+      </w:r>
+      <w:r>
+        <w:rPr>
+          <w:i/>
+          <w:iCs/>
+        </w:rPr>
+        <w:t xml:space="preserve">(Was your targeted refinement effective? Did addressing the weaknesses you identified actually improve those rubric scores?):</w:t>
+      </w:r>
+    </w:p>
+    <w:p>
+      <w:r>
+        <w:pict>
+          <v:rect style="width:0;height:1.5pt" o:hralign="center" o:hrstd="t" o:hr="t"/>
+        </w:pict>
+      </w:r>
+    </w:p>
+    <w:bookmarkEnd w:id="26"/>
+    <w:bookmarkStart w:id="27" w:name="prompt-revision-reasoning-1"/>
+    <w:p>
+      <w:pPr>
+        <w:pStyle w:val="Heading4"/>
+      </w:pPr>
+      <w:r>
+        <w:t xml:space="preserve">Prompt Revision Reasoning</w:t>
+      </w:r>
+    </w:p>
+    <w:p>
+      <w:pPr>
+        <w:pStyle w:val="FirstParagraph"/>
+      </w:pPr>
+      <w:r>
+        <w:rPr>
+          <w:b/>
+          <w:bCs/>
+        </w:rPr>
+        <w:t xml:space="preserve">Specific prompt elements you changed, added, or deleted:</w:t>
+      </w:r>
+    </w:p>
+    <w:tbl>
+      <w:tblPr>
+        <w:tblStyle w:val="Table"/>
+        <w:tblW w:type="pct" w:w="5000"/>
+        <w:tblLayout w:type="fixed"/>
+        <w:tblLook w:firstRow="1" w:lastRow="0" w:firstColumn="0" w:lastColumn="0" w:noHBand="0" w:noVBand="0" w:val="0020"/>
+      </w:tblPr>
+      <w:tblGrid>
+        <w:gridCol w:w="1240"/>
+        <w:gridCol w:w="2958"/>
+        <w:gridCol w:w="3721"/>
+      </w:tblGrid>
+      <w:tr>
+        <w:trPr>
+          <w:tblHeader w:val="on"/>
+        </w:trPr>
+        <w:tc>
+          <w:tcPr/>
+          <w:p>
+            <w:pPr>
+              <w:pStyle w:val="Compact"/>
+              <w:jc w:val="center"/>
+            </w:pPr>
+            <w:r>
+              <w:t xml:space="preserve">Change Type</w:t>
+            </w:r>
+          </w:p>
+        </w:tc>
+        <w:tc>
+          <w:tcPr/>
+          <w:p>
+            <w:pPr>
+              <w:pStyle w:val="Compact"/>
+            </w:pPr>
+            <w:r>
+              <w:t xml:space="preserve">What You Changed in the Prompt</w:t>
+            </w:r>
+          </w:p>
+        </w:tc>
+        <w:tc>
+          <w:tcPr/>
+          <w:p>
+            <w:pPr>
+              <w:pStyle w:val="Compact"/>
+            </w:pPr>
+            <w:r>
+              <w:t xml:space="preserve">Which Strength/Weakness This Addresses</w:t>
+            </w:r>
+          </w:p>
+        </w:tc>
+      </w:tr>
+      <w:tr>
+        <w:tc>
+          <w:tcPr/>
+          <w:p>
+            <w:pPr>
+              <w:pStyle w:val="Compact"/>
+              <w:jc w:val="center"/>
+            </w:pPr>
+            <w:r>
+              <w:t xml:space="preserve">Changed</w:t>
+            </w:r>
+          </w:p>
+        </w:tc>
+        <w:tc>
+          <w:tcPr/>
+          <w:p>
+            <w:pPr>
+              <w:pStyle w:val="Compact"/>
+            </w:pPr>
+          </w:p>
+        </w:tc>
+        <w:tc>
+          <w:tcPr/>
+          <w:p>
+            <w:pPr>
+              <w:pStyle w:val="Compact"/>
+            </w:pPr>
+          </w:p>
+        </w:tc>
+      </w:tr>
+      <w:tr>
+        <w:tc>
+          <w:tcPr/>
+          <w:p>
+            <w:pPr>
+              <w:pStyle w:val="Compact"/>
+              <w:jc w:val="center"/>
+            </w:pPr>
+            <w:r>
+              <w:t xml:space="preserve">Added</w:t>
+            </w:r>
+          </w:p>
+        </w:tc>
+        <w:tc>
+          <w:tcPr/>
+          <w:p>
+            <w:pPr>
+              <w:pStyle w:val="Compact"/>
+            </w:pPr>
+          </w:p>
+        </w:tc>
+        <w:tc>
+          <w:tcPr/>
+          <w:p>
+            <w:pPr>
+              <w:pStyle w:val="Compact"/>
+            </w:pPr>
+          </w:p>
+        </w:tc>
+      </w:tr>
+      <w:tr>
+        <w:tc>
+          <w:tcPr/>
+          <w:p>
+            <w:pPr>
+              <w:pStyle w:val="Compact"/>
+              <w:jc w:val="center"/>
+            </w:pPr>
+            <w:r>
+              <w:t xml:space="preserve">Deleted</w:t>
+            </w:r>
+          </w:p>
+        </w:tc>
+        <w:tc>
+          <w:tcPr/>
+          <w:p>
+            <w:pPr>
+              <w:pStyle w:val="Compact"/>
+            </w:pPr>
+          </w:p>
+        </w:tc>
+        <w:tc>
+          <w:tcPr/>
+          <w:p>
+            <w:pPr>
+              <w:pStyle w:val="Compact"/>
+            </w:pPr>
+          </w:p>
+        </w:tc>
+      </w:tr>
+    </w:tbl>
+    <w:p>
+      <w:pPr>
+        <w:pStyle w:val="BodyText"/>
+      </w:pPr>
+      <w:r>
+        <w:rPr>
+          <w:b/>
+          <w:bCs/>
+        </w:rPr>
+        <w:t xml:space="preserve">Why you believe these changes will improve the output:</w:t>
+      </w:r>
+    </w:p>
+    <w:p>
+      <w:r>
+        <w:pict>
+          <v:rect style="width:0;height:1.5pt" o:hralign="center" o:hrstd="t" o:hr="t"/>
+        </w:pict>
       </w:r>
     </w:p>
     <w:p>
@@ -5289,25 +5800,6 @@
           <w:b/>
           <w:bCs/>
         </w:rPr>
-        <w:t xml:space="preserve">What You Changed and Why:</w:t>
-      </w:r>
-    </w:p>
-    <w:p>
-      <w:r>
-        <w:pict>
-          <v:rect style="width:0;height:1.5pt" o:hralign="center" o:hrstd="t" o:hr="t"/>
-        </w:pict>
-      </w:r>
-    </w:p>
-    <w:p>
-      <w:pPr>
-        <w:pStyle w:val="FirstParagraph"/>
-      </w:pPr>
-      <w:r>
-        <w:rPr>
-          <w:b/>
-          <w:bCs/>
-        </w:rPr>
         <w:t xml:space="preserve">Refinement Strategy Used</w:t>
       </w:r>
       <w:r>
@@ -5390,7 +5882,8 @@
         <w:t xml:space="preserve">SongA_Round3.mp3</w:t>
       </w:r>
     </w:p>
-    <w:bookmarkStart w:id="24" w:name="harmonic-rubric-song-a-round-3"/>
+    <w:bookmarkEnd w:id="27"/>
+    <w:bookmarkStart w:id="28" w:name="harmonic-rubric-song-a-round-3"/>
     <w:p>
       <w:pPr>
         <w:pStyle w:val="Heading4"/>
@@ -7501,9 +7994,9 @@
         </w:pict>
       </w:r>
     </w:p>
-    <w:bookmarkEnd w:id="24"/>
-    <w:bookmarkEnd w:id="25"/>
-    <w:bookmarkStart w:id="26" w:name="song-a-score-trajectory"/>
+    <w:bookmarkEnd w:id="28"/>
+    <w:bookmarkEnd w:id="29"/>
+    <w:bookmarkStart w:id="30" w:name="song-a-score-trajectory"/>
     <w:p>
       <w:pPr>
         <w:pStyle w:val="Heading3"/>
@@ -7852,9 +8345,9 @@
         </w:pict>
       </w:r>
     </w:p>
-    <w:bookmarkEnd w:id="26"/>
-    <w:bookmarkEnd w:id="27"/>
-    <w:bookmarkStart w:id="35" w:name="song-b-rounds-1-3"/>
+    <w:bookmarkEnd w:id="30"/>
+    <w:bookmarkEnd w:id="31"/>
+    <w:bookmarkStart w:id="43" w:name="song-b-rounds-1-3"/>
     <w:p>
       <w:pPr>
         <w:pStyle w:val="Heading2"/>
@@ -7863,7 +8356,7 @@
         <w:t xml:space="preserve">3. Song B: Rounds 1-3</w:t>
       </w:r>
     </w:p>
-    <w:bookmarkStart w:id="29" w:name="song-b-round-1-baseline"/>
+    <w:bookmarkStart w:id="33" w:name="song-b-round-1-baseline"/>
     <w:p>
       <w:pPr>
         <w:pStyle w:val="Heading3"/>
@@ -7926,7 +8419,7 @@
         <w:t xml:space="preserve">SongB_Round1.mp3</w:t>
       </w:r>
     </w:p>
-    <w:bookmarkStart w:id="28" w:name="harmonic-rubric-song-b-round-1"/>
+    <w:bookmarkStart w:id="32" w:name="harmonic-rubric-song-b-round-1"/>
     <w:p>
       <w:pPr>
         <w:pStyle w:val="Heading4"/>
@@ -10018,15 +10511,265 @@
         </w:pict>
       </w:r>
     </w:p>
-    <w:bookmarkEnd w:id="28"/>
-    <w:bookmarkEnd w:id="29"/>
-    <w:bookmarkStart w:id="31" w:name="song-b-round-2-targeted-refinement"/>
+    <w:bookmarkEnd w:id="32"/>
+    <w:bookmarkEnd w:id="33"/>
+    <w:bookmarkStart w:id="37" w:name="song-b-round-2-targeted-refinement"/>
     <w:p>
       <w:pPr>
         <w:pStyle w:val="Heading3"/>
       </w:pPr>
       <w:r>
         <w:t xml:space="preserve">Song B — Round 2 (Targeted Refinement)</w:t>
+      </w:r>
+    </w:p>
+    <w:bookmarkStart w:id="34" w:name="reflection-on-round-1-1"/>
+    <w:p>
+      <w:pPr>
+        <w:pStyle w:val="Heading4"/>
+      </w:pPr>
+      <w:r>
+        <w:t xml:space="preserve">Reflection on Round 1</w:t>
+      </w:r>
+    </w:p>
+    <w:p>
+      <w:pPr>
+        <w:pStyle w:val="FirstParagraph"/>
+      </w:pPr>
+      <w:r>
+        <w:rPr>
+          <w:b/>
+          <w:bCs/>
+        </w:rPr>
+        <w:t xml:space="preserve">Strengths from Round 1</w:t>
+      </w:r>
+      <w:r>
+        <w:t xml:space="preserve"> </w:t>
+      </w:r>
+      <w:r>
+        <w:rPr>
+          <w:i/>
+          <w:iCs/>
+        </w:rPr>
+        <w:t xml:space="preserve">(What worked well? Which rubric categories scored highest and why?):</w:t>
+      </w:r>
+    </w:p>
+    <w:p>
+      <w:r>
+        <w:pict>
+          <v:rect style="width:0;height:1.5pt" o:hralign="center" o:hrstd="t" o:hr="t"/>
+        </w:pict>
+      </w:r>
+    </w:p>
+    <w:p>
+      <w:pPr>
+        <w:pStyle w:val="FirstParagraph"/>
+      </w:pPr>
+      <w:r>
+        <w:rPr>
+          <w:b/>
+          <w:bCs/>
+        </w:rPr>
+        <w:t xml:space="preserve">Weaknesses from Round 1</w:t>
+      </w:r>
+      <w:r>
+        <w:t xml:space="preserve"> </w:t>
+      </w:r>
+      <w:r>
+        <w:rPr>
+          <w:i/>
+          <w:iCs/>
+        </w:rPr>
+        <w:t xml:space="preserve">(What fell short? Which rubric categories scored lowest and why?):</w:t>
+      </w:r>
+    </w:p>
+    <w:p>
+      <w:r>
+        <w:pict>
+          <v:rect style="width:0;height:1.5pt" o:hralign="center" o:hrstd="t" o:hr="t"/>
+        </w:pict>
+      </w:r>
+    </w:p>
+    <w:bookmarkEnd w:id="34"/>
+    <w:bookmarkStart w:id="35" w:name="prompt-revision-reasoning-2"/>
+    <w:p>
+      <w:pPr>
+        <w:pStyle w:val="Heading4"/>
+      </w:pPr>
+      <w:r>
+        <w:t xml:space="preserve">Prompt Revision Reasoning</w:t>
+      </w:r>
+    </w:p>
+    <w:p>
+      <w:pPr>
+        <w:pStyle w:val="FirstParagraph"/>
+      </w:pPr>
+      <w:r>
+        <w:rPr>
+          <w:b/>
+          <w:bCs/>
+        </w:rPr>
+        <w:t xml:space="preserve">Specific prompt elements you changed, added, or deleted:</w:t>
+      </w:r>
+    </w:p>
+    <w:tbl>
+      <w:tblPr>
+        <w:tblStyle w:val="Table"/>
+        <w:tblW w:type="pct" w:w="5000"/>
+        <w:tblLayout w:type="fixed"/>
+        <w:tblLook w:firstRow="1" w:lastRow="0" w:firstColumn="0" w:lastColumn="0" w:noHBand="0" w:noVBand="0" w:val="0020"/>
+      </w:tblPr>
+      <w:tblGrid>
+        <w:gridCol w:w="1240"/>
+        <w:gridCol w:w="2958"/>
+        <w:gridCol w:w="3721"/>
+      </w:tblGrid>
+      <w:tr>
+        <w:trPr>
+          <w:tblHeader w:val="on"/>
+        </w:trPr>
+        <w:tc>
+          <w:tcPr/>
+          <w:p>
+            <w:pPr>
+              <w:pStyle w:val="Compact"/>
+              <w:jc w:val="center"/>
+            </w:pPr>
+            <w:r>
+              <w:t xml:space="preserve">Change Type</w:t>
+            </w:r>
+          </w:p>
+        </w:tc>
+        <w:tc>
+          <w:tcPr/>
+          <w:p>
+            <w:pPr>
+              <w:pStyle w:val="Compact"/>
+            </w:pPr>
+            <w:r>
+              <w:t xml:space="preserve">What You Changed in the Prompt</w:t>
+            </w:r>
+          </w:p>
+        </w:tc>
+        <w:tc>
+          <w:tcPr/>
+          <w:p>
+            <w:pPr>
+              <w:pStyle w:val="Compact"/>
+            </w:pPr>
+            <w:r>
+              <w:t xml:space="preserve">Which Strength/Weakness This Addresses</w:t>
+            </w:r>
+          </w:p>
+        </w:tc>
+      </w:tr>
+      <w:tr>
+        <w:tc>
+          <w:tcPr/>
+          <w:p>
+            <w:pPr>
+              <w:pStyle w:val="Compact"/>
+              <w:jc w:val="center"/>
+            </w:pPr>
+            <w:r>
+              <w:t xml:space="preserve">Changed</w:t>
+            </w:r>
+          </w:p>
+        </w:tc>
+        <w:tc>
+          <w:tcPr/>
+          <w:p>
+            <w:pPr>
+              <w:pStyle w:val="Compact"/>
+            </w:pPr>
+          </w:p>
+        </w:tc>
+        <w:tc>
+          <w:tcPr/>
+          <w:p>
+            <w:pPr>
+              <w:pStyle w:val="Compact"/>
+            </w:pPr>
+          </w:p>
+        </w:tc>
+      </w:tr>
+      <w:tr>
+        <w:tc>
+          <w:tcPr/>
+          <w:p>
+            <w:pPr>
+              <w:pStyle w:val="Compact"/>
+              <w:jc w:val="center"/>
+            </w:pPr>
+            <w:r>
+              <w:t xml:space="preserve">Added</w:t>
+            </w:r>
+          </w:p>
+        </w:tc>
+        <w:tc>
+          <w:tcPr/>
+          <w:p>
+            <w:pPr>
+              <w:pStyle w:val="Compact"/>
+            </w:pPr>
+          </w:p>
+        </w:tc>
+        <w:tc>
+          <w:tcPr/>
+          <w:p>
+            <w:pPr>
+              <w:pStyle w:val="Compact"/>
+            </w:pPr>
+          </w:p>
+        </w:tc>
+      </w:tr>
+      <w:tr>
+        <w:tc>
+          <w:tcPr/>
+          <w:p>
+            <w:pPr>
+              <w:pStyle w:val="Compact"/>
+              <w:jc w:val="center"/>
+            </w:pPr>
+            <w:r>
+              <w:t xml:space="preserve">Deleted</w:t>
+            </w:r>
+          </w:p>
+        </w:tc>
+        <w:tc>
+          <w:tcPr/>
+          <w:p>
+            <w:pPr>
+              <w:pStyle w:val="Compact"/>
+            </w:pPr>
+          </w:p>
+        </w:tc>
+        <w:tc>
+          <w:tcPr/>
+          <w:p>
+            <w:pPr>
+              <w:pStyle w:val="Compact"/>
+            </w:pPr>
+          </w:p>
+        </w:tc>
+      </w:tr>
+    </w:tbl>
+    <w:p>
+      <w:pPr>
+        <w:pStyle w:val="BodyText"/>
+      </w:pPr>
+      <w:r>
+        <w:rPr>
+          <w:b/>
+          <w:bCs/>
+        </w:rPr>
+        <w:t xml:space="preserve">Why you believe these changes will improve the output:</w:t>
+      </w:r>
+    </w:p>
+    <w:p>
+      <w:r>
+        <w:pict>
+          <v:rect style="width:0;height:1.5pt" o:hralign="center" o:hrstd="t" o:hr="t"/>
+        </w:pict>
       </w:r>
     </w:p>
     <w:p>
@@ -10071,25 +10814,6 @@
           <w:b/>
           <w:bCs/>
         </w:rPr>
-        <w:t xml:space="preserve">What You Changed and Why:</w:t>
-      </w:r>
-    </w:p>
-    <w:p>
-      <w:r>
-        <w:pict>
-          <v:rect style="width:0;height:1.5pt" o:hralign="center" o:hrstd="t" o:hr="t"/>
-        </w:pict>
-      </w:r>
-    </w:p>
-    <w:p>
-      <w:pPr>
-        <w:pStyle w:val="FirstParagraph"/>
-      </w:pPr>
-      <w:r>
-        <w:rPr>
-          <w:b/>
-          <w:bCs/>
-        </w:rPr>
         <w:t xml:space="preserve">Refinement Strategy Used</w:t>
       </w:r>
       <w:r>
@@ -10172,7 +10896,8 @@
         <w:t xml:space="preserve">SongB_Round2.mp3</w:t>
       </w:r>
     </w:p>
-    <w:bookmarkStart w:id="30" w:name="harmonic-rubric-song-b-round-2"/>
+    <w:bookmarkEnd w:id="35"/>
+    <w:bookmarkStart w:id="36" w:name="harmonic-rubric-song-b-round-2"/>
     <w:p>
       <w:pPr>
         <w:pStyle w:val="Heading4"/>
@@ -12283,15 +13008,294 @@
         </w:pict>
       </w:r>
     </w:p>
-    <w:bookmarkEnd w:id="30"/>
-    <w:bookmarkEnd w:id="31"/>
-    <w:bookmarkStart w:id="33" w:name="song-b-round-3-fine-tuning"/>
+    <w:bookmarkEnd w:id="36"/>
+    <w:bookmarkEnd w:id="37"/>
+    <w:bookmarkStart w:id="41" w:name="song-b-round-3-fine-tuning"/>
     <w:p>
       <w:pPr>
         <w:pStyle w:val="Heading3"/>
       </w:pPr>
       <w:r>
         <w:t xml:space="preserve">Song B — Round 3 (Fine-Tuning)</w:t>
+      </w:r>
+    </w:p>
+    <w:bookmarkStart w:id="38" w:name="reflection-on-rounds-1-and-2-1"/>
+    <w:p>
+      <w:pPr>
+        <w:pStyle w:val="Heading4"/>
+      </w:pPr>
+      <w:r>
+        <w:t xml:space="preserve">Reflection on Rounds 1 and 2</w:t>
+      </w:r>
+    </w:p>
+    <w:p>
+      <w:pPr>
+        <w:pStyle w:val="FirstParagraph"/>
+      </w:pPr>
+      <w:r>
+        <w:rPr>
+          <w:b/>
+          <w:bCs/>
+        </w:rPr>
+        <w:t xml:space="preserve">Strengths from Round 2</w:t>
+      </w:r>
+      <w:r>
+        <w:t xml:space="preserve"> </w:t>
+      </w:r>
+      <w:r>
+        <w:rPr>
+          <w:i/>
+          <w:iCs/>
+        </w:rPr>
+        <w:t xml:space="preserve">(What improved from Round 1? What new strengths emerged?):</w:t>
+      </w:r>
+    </w:p>
+    <w:p>
+      <w:r>
+        <w:pict>
+          <v:rect style="width:0;height:1.5pt" o:hralign="center" o:hrstd="t" o:hr="t"/>
+        </w:pict>
+      </w:r>
+    </w:p>
+    <w:p>
+      <w:pPr>
+        <w:pStyle w:val="FirstParagraph"/>
+      </w:pPr>
+      <w:r>
+        <w:rPr>
+          <w:b/>
+          <w:bCs/>
+        </w:rPr>
+        <w:t xml:space="preserve">Remaining weaknesses</w:t>
+      </w:r>
+      <w:r>
+        <w:t xml:space="preserve"> </w:t>
+      </w:r>
+      <w:r>
+        <w:rPr>
+          <w:i/>
+          <w:iCs/>
+        </w:rPr>
+        <w:t xml:space="preserve">(What issues persisted or appeared despite Round 2 refinements?):</w:t>
+      </w:r>
+    </w:p>
+    <w:p>
+      <w:r>
+        <w:pict>
+          <v:rect style="width:0;height:1.5pt" o:hralign="center" o:hrstd="t" o:hr="t"/>
+        </w:pict>
+      </w:r>
+    </w:p>
+    <w:p>
+      <w:pPr>
+        <w:pStyle w:val="FirstParagraph"/>
+      </w:pPr>
+      <w:r>
+        <w:rPr>
+          <w:b/>
+          <w:bCs/>
+        </w:rPr>
+        <w:t xml:space="preserve">Assessment of Round 2 refinement strategy</w:t>
+      </w:r>
+      <w:r>
+        <w:t xml:space="preserve"> </w:t>
+      </w:r>
+      <w:r>
+        <w:rPr>
+          <w:i/>
+          <w:iCs/>
+        </w:rPr>
+        <w:t xml:space="preserve">(Was your targeted refinement effective? Did addressing the weaknesses you identified actually improve those rubric scores?):</w:t>
+      </w:r>
+    </w:p>
+    <w:p>
+      <w:r>
+        <w:pict>
+          <v:rect style="width:0;height:1.5pt" o:hralign="center" o:hrstd="t" o:hr="t"/>
+        </w:pict>
+      </w:r>
+    </w:p>
+    <w:bookmarkEnd w:id="38"/>
+    <w:bookmarkStart w:id="39" w:name="prompt-revision-reasoning-3"/>
+    <w:p>
+      <w:pPr>
+        <w:pStyle w:val="Heading4"/>
+      </w:pPr>
+      <w:r>
+        <w:t xml:space="preserve">Prompt Revision Reasoning</w:t>
+      </w:r>
+    </w:p>
+    <w:p>
+      <w:pPr>
+        <w:pStyle w:val="FirstParagraph"/>
+      </w:pPr>
+      <w:r>
+        <w:rPr>
+          <w:b/>
+          <w:bCs/>
+        </w:rPr>
+        <w:t xml:space="preserve">Specific prompt elements you changed, added, or deleted:</w:t>
+      </w:r>
+    </w:p>
+    <w:tbl>
+      <w:tblPr>
+        <w:tblStyle w:val="Table"/>
+        <w:tblW w:type="pct" w:w="5000"/>
+        <w:tblLayout w:type="fixed"/>
+        <w:tblLook w:firstRow="1" w:lastRow="0" w:firstColumn="0" w:lastColumn="0" w:noHBand="0" w:noVBand="0" w:val="0020"/>
+      </w:tblPr>
+      <w:tblGrid>
+        <w:gridCol w:w="1240"/>
+        <w:gridCol w:w="2958"/>
+        <w:gridCol w:w="3721"/>
+      </w:tblGrid>
+      <w:tr>
+        <w:trPr>
+          <w:tblHeader w:val="on"/>
+        </w:trPr>
+        <w:tc>
+          <w:tcPr/>
+          <w:p>
+            <w:pPr>
+              <w:pStyle w:val="Compact"/>
+              <w:jc w:val="center"/>
+            </w:pPr>
+            <w:r>
+              <w:t xml:space="preserve">Change Type</w:t>
+            </w:r>
+          </w:p>
+        </w:tc>
+        <w:tc>
+          <w:tcPr/>
+          <w:p>
+            <w:pPr>
+              <w:pStyle w:val="Compact"/>
+            </w:pPr>
+            <w:r>
+              <w:t xml:space="preserve">What You Changed in the Prompt</w:t>
+            </w:r>
+          </w:p>
+        </w:tc>
+        <w:tc>
+          <w:tcPr/>
+          <w:p>
+            <w:pPr>
+              <w:pStyle w:val="Compact"/>
+            </w:pPr>
+            <w:r>
+              <w:t xml:space="preserve">Which Strength/Weakness This Addresses</w:t>
+            </w:r>
+          </w:p>
+        </w:tc>
+      </w:tr>
+      <w:tr>
+        <w:tc>
+          <w:tcPr/>
+          <w:p>
+            <w:pPr>
+              <w:pStyle w:val="Compact"/>
+              <w:jc w:val="center"/>
+            </w:pPr>
+            <w:r>
+              <w:t xml:space="preserve">Changed</w:t>
+            </w:r>
+          </w:p>
+        </w:tc>
+        <w:tc>
+          <w:tcPr/>
+          <w:p>
+            <w:pPr>
+              <w:pStyle w:val="Compact"/>
+            </w:pPr>
+          </w:p>
+        </w:tc>
+        <w:tc>
+          <w:tcPr/>
+          <w:p>
+            <w:pPr>
+              <w:pStyle w:val="Compact"/>
+            </w:pPr>
+          </w:p>
+        </w:tc>
+      </w:tr>
+      <w:tr>
+        <w:tc>
+          <w:tcPr/>
+          <w:p>
+            <w:pPr>
+              <w:pStyle w:val="Compact"/>
+              <w:jc w:val="center"/>
+            </w:pPr>
+            <w:r>
+              <w:t xml:space="preserve">Added</w:t>
+            </w:r>
+          </w:p>
+        </w:tc>
+        <w:tc>
+          <w:tcPr/>
+          <w:p>
+            <w:pPr>
+              <w:pStyle w:val="Compact"/>
+            </w:pPr>
+          </w:p>
+        </w:tc>
+        <w:tc>
+          <w:tcPr/>
+          <w:p>
+            <w:pPr>
+              <w:pStyle w:val="Compact"/>
+            </w:pPr>
+          </w:p>
+        </w:tc>
+      </w:tr>
+      <w:tr>
+        <w:tc>
+          <w:tcPr/>
+          <w:p>
+            <w:pPr>
+              <w:pStyle w:val="Compact"/>
+              <w:jc w:val="center"/>
+            </w:pPr>
+            <w:r>
+              <w:t xml:space="preserve">Deleted</w:t>
+            </w:r>
+          </w:p>
+        </w:tc>
+        <w:tc>
+          <w:tcPr/>
+          <w:p>
+            <w:pPr>
+              <w:pStyle w:val="Compact"/>
+            </w:pPr>
+          </w:p>
+        </w:tc>
+        <w:tc>
+          <w:tcPr/>
+          <w:p>
+            <w:pPr>
+              <w:pStyle w:val="Compact"/>
+            </w:pPr>
+          </w:p>
+        </w:tc>
+      </w:tr>
+    </w:tbl>
+    <w:p>
+      <w:pPr>
+        <w:pStyle w:val="BodyText"/>
+      </w:pPr>
+      <w:r>
+        <w:rPr>
+          <w:b/>
+          <w:bCs/>
+        </w:rPr>
+        <w:t xml:space="preserve">Why you believe these changes will improve the output:</w:t>
+      </w:r>
+    </w:p>
+    <w:p>
+      <w:r>
+        <w:pict>
+          <v:rect style="width:0;height:1.5pt" o:hralign="center" o:hrstd="t" o:hr="t"/>
+        </w:pict>
       </w:r>
     </w:p>
     <w:p>
@@ -12336,25 +13340,6 @@
           <w:b/>
           <w:bCs/>
         </w:rPr>
-        <w:t xml:space="preserve">What You Changed and Why:</w:t>
-      </w:r>
-    </w:p>
-    <w:p>
-      <w:r>
-        <w:pict>
-          <v:rect style="width:0;height:1.5pt" o:hralign="center" o:hrstd="t" o:hr="t"/>
-        </w:pict>
-      </w:r>
-    </w:p>
-    <w:p>
-      <w:pPr>
-        <w:pStyle w:val="FirstParagraph"/>
-      </w:pPr>
-      <w:r>
-        <w:rPr>
-          <w:b/>
-          <w:bCs/>
-        </w:rPr>
         <w:t xml:space="preserve">Refinement Strategy Used</w:t>
       </w:r>
       <w:r>
@@ -12437,7 +13422,8 @@
         <w:t xml:space="preserve">SongB_Round3.mp3</w:t>
       </w:r>
     </w:p>
-    <w:bookmarkStart w:id="32" w:name="harmonic-rubric-song-b-round-3"/>
+    <w:bookmarkEnd w:id="39"/>
+    <w:bookmarkStart w:id="40" w:name="harmonic-rubric-song-b-round-3"/>
     <w:p>
       <w:pPr>
         <w:pStyle w:val="Heading4"/>
@@ -14548,9 +15534,9 @@
         </w:pict>
       </w:r>
     </w:p>
-    <w:bookmarkEnd w:id="32"/>
-    <w:bookmarkEnd w:id="33"/>
-    <w:bookmarkStart w:id="34" w:name="song-b-score-trajectory"/>
+    <w:bookmarkEnd w:id="40"/>
+    <w:bookmarkEnd w:id="41"/>
+    <w:bookmarkStart w:id="42" w:name="song-b-score-trajectory"/>
     <w:p>
       <w:pPr>
         <w:pStyle w:val="Heading3"/>
@@ -14899,9 +15885,9 @@
         </w:pict>
       </w:r>
     </w:p>
-    <w:bookmarkEnd w:id="34"/>
-    <w:bookmarkEnd w:id="35"/>
-    <w:bookmarkStart w:id="40" w:name="summary-report"/>
+    <w:bookmarkEnd w:id="42"/>
+    <w:bookmarkEnd w:id="43"/>
+    <w:bookmarkStart w:id="48" w:name="summary-report"/>
     <w:p>
       <w:pPr>
         <w:pStyle w:val="Heading2"/>
@@ -14910,7 +15896,7 @@
         <w:t xml:space="preserve">4. Summary Report</w:t>
       </w:r>
     </w:p>
-    <w:bookmarkStart w:id="36" w:name="a.-overall-impressions"/>
+    <w:bookmarkStart w:id="44" w:name="a.-overall-impressions"/>
     <w:p>
       <w:pPr>
         <w:pStyle w:val="Heading3"/>
@@ -14938,8 +15924,8 @@
         </w:pict>
       </w:r>
     </w:p>
-    <w:bookmarkEnd w:id="36"/>
-    <w:bookmarkStart w:id="37" w:name="b.-prompt-engineering-strategies"/>
+    <w:bookmarkEnd w:id="44"/>
+    <w:bookmarkStart w:id="45" w:name="b.-prompt-engineering-strategies"/>
     <w:p>
       <w:pPr>
         <w:pStyle w:val="Heading3"/>
@@ -14967,8 +15953,8 @@
         </w:pict>
       </w:r>
     </w:p>
-    <w:bookmarkEnd w:id="37"/>
-    <w:bookmarkStart w:id="38" w:name="c.-quality-trajectory"/>
+    <w:bookmarkEnd w:id="45"/>
+    <w:bookmarkStart w:id="46" w:name="c.-quality-trajectory"/>
     <w:p>
       <w:pPr>
         <w:pStyle w:val="Heading3"/>
@@ -14996,8 +15982,8 @@
         </w:pict>
       </w:r>
     </w:p>
-    <w:bookmarkEnd w:id="38"/>
-    <w:bookmarkStart w:id="39" w:name="d.-big-questions"/>
+    <w:bookmarkEnd w:id="46"/>
+    <w:bookmarkStart w:id="47" w:name="d.-big-questions"/>
     <w:p>
       <w:pPr>
         <w:pStyle w:val="Heading3"/>
@@ -15032,9 +16018,9 @@
         </w:pict>
       </w:r>
     </w:p>
-    <w:bookmarkEnd w:id="39"/>
-    <w:bookmarkEnd w:id="40"/>
-    <w:bookmarkStart w:id="41" w:name="submission-checklist-final-verification"/>
+    <w:bookmarkEnd w:id="47"/>
+    <w:bookmarkEnd w:id="48"/>
+    <w:bookmarkStart w:id="49" w:name="submission-checklist-final-verification"/>
     <w:p>
       <w:pPr>
         <w:pStyle w:val="Heading2"/>
@@ -15167,8 +16153,8 @@
         <w:t xml:space="preserve">SongB_Round3.mp3</w:t>
       </w:r>
     </w:p>
-    <w:bookmarkEnd w:id="41"/>
-    <w:bookmarkEnd w:id="42"/>
+    <w:bookmarkEnd w:id="49"/>
+    <w:bookmarkEnd w:id="50"/>
     <w:sectPr>
       <w:footnotePr>
         <w:numRestart w:val="eachSect"/>

</xml_diff>

<commit_message>
Split post-rubric evaluation into Song vs Prompt assessments, update image
After each round's rubric, students now separately evaluate:
(a) Song: musical strengths/weaknesses citing specific moments
(b) Prompt: which keywords/phrases worked, were ignored, or misinterpreted

Round 2/3 reflection sections now separately identify song issues vs
prompt issues to fix, with a 4-column revision table mapping exact
prompt changes to the specific song or prompt issue and reasoning.

Also update README hero image to 2026spr.jpg.

Co-Authored-By: Claude Opus 4.6 (1M context) <noreply@anthropic.com>
</commit_message>
<xml_diff>
--- a/docs/final_report_template.docx
+++ b/docs/final_report_template.docx
@@ -2,7 +2,7 @@
 <file path=word/document.xml><?xml version="1.0" encoding="utf-8"?>
 <w:document xmlns:w="http://schemas.openxmlformats.org/wordprocessingml/2006/main" xmlns:m="http://schemas.openxmlformats.org/officeDocument/2006/math" xmlns:r="http://schemas.openxmlformats.org/officeDocument/2006/relationships" xmlns:o="urn:schemas-microsoft-com:office:office" xmlns:v="urn:schemas-microsoft-com:vml" xmlns:w10="urn:schemas-microsoft-com:office:word" xmlns:a="http://schemas.openxmlformats.org/drawingml/2006/main" xmlns:pic="http://schemas.openxmlformats.org/drawingml/2006/picture" xmlns:wp="http://schemas.openxmlformats.org/drawingml/2006/wordprocessingDrawing">
   <w:body>
-    <w:bookmarkStart w:id="50" w:name="mini-project-3-final-report"/>
+    <w:bookmarkStart w:id="62" w:name="mini-project-3-final-report"/>
     <w:p>
       <w:pPr>
         <w:pStyle w:val="Heading1"/>
@@ -807,7 +807,7 @@
     </w:p>
     <w:bookmarkEnd w:id="18"/>
     <w:bookmarkEnd w:id="19"/>
-    <w:bookmarkStart w:id="31" w:name="song-a-rounds-1-3"/>
+    <w:bookmarkStart w:id="37" w:name="song-a-rounds-1-3"/>
     <w:p>
       <w:pPr>
         <w:pStyle w:val="Heading2"/>
@@ -816,7 +816,7 @@
         <w:t xml:space="preserve">2. Song A: Rounds 1-3</w:t>
       </w:r>
     </w:p>
-    <w:bookmarkStart w:id="21" w:name="song-a-round-1-baseline"/>
+    <w:bookmarkStart w:id="23" w:name="song-a-round-1-baseline"/>
     <w:p>
       <w:pPr>
         <w:pStyle w:val="Heading3"/>
@@ -2926,16 +2926,36 @@
         <w:t xml:space="preserve">Composite Score: _____ / 100</w:t>
       </w:r>
     </w:p>
-    <w:p>
-      <w:pPr>
-        <w:pStyle w:val="BodyText"/>
+    <w:bookmarkEnd w:id="20"/>
+    <w:bookmarkStart w:id="21" w:name="song-evaluation"/>
+    <w:p>
+      <w:pPr>
+        <w:pStyle w:val="Heading4"/>
+      </w:pPr>
+      <w:r>
+        <w:t xml:space="preserve">Song Evaluation</w:t>
+      </w:r>
+    </w:p>
+    <w:p>
+      <w:pPr>
+        <w:pStyle w:val="FirstParagraph"/>
       </w:pPr>
       <w:r>
         <w:rPr>
           <w:b/>
           <w:bCs/>
         </w:rPr>
-        <w:t xml:space="preserve">Strengths:</w:t>
+        <w:t xml:space="preserve">Song Strengths</w:t>
+      </w:r>
+      <w:r>
+        <w:t xml:space="preserve"> </w:t>
+      </w:r>
+      <w:r>
+        <w:rPr>
+          <w:i/>
+          <w:iCs/>
+        </w:rPr>
+        <w:t xml:space="preserve">(What sounds good? Cite specific musical moments — e.g., melody, rhythm, production, emotional impact, genre authenticity):</w:t>
       </w:r>
     </w:p>
     <w:p>
@@ -2954,7 +2974,17 @@
           <w:b/>
           <w:bCs/>
         </w:rPr>
-        <w:t xml:space="preserve">Weaknesses:</w:t>
+        <w:t xml:space="preserve">Song Weaknesses</w:t>
+      </w:r>
+      <w:r>
+        <w:t xml:space="preserve"> </w:t>
+      </w:r>
+      <w:r>
+        <w:rPr>
+          <w:i/>
+          <w:iCs/>
+        </w:rPr>
+        <w:t xml:space="preserve">(What sounds wrong or weak? Cite specific musical problems — e.g., artifacts, wrong instruments, weak structure, missing emotion):</w:t>
       </w:r>
     </w:p>
     <w:p>
@@ -2964,6 +2994,38 @@
         </w:pict>
       </w:r>
     </w:p>
+    <w:bookmarkEnd w:id="21"/>
+    <w:bookmarkStart w:id="22" w:name="prompt-evaluation"/>
+    <w:p>
+      <w:pPr>
+        <w:pStyle w:val="Heading4"/>
+      </w:pPr>
+      <w:r>
+        <w:t xml:space="preserve">Prompt Evaluation</w:t>
+      </w:r>
+    </w:p>
+    <w:p>
+      <w:pPr>
+        <w:pStyle w:val="FirstParagraph"/>
+      </w:pPr>
+      <w:r>
+        <w:rPr>
+          <w:b/>
+          <w:bCs/>
+        </w:rPr>
+        <w:t xml:space="preserve">What worked in the prompt</w:t>
+      </w:r>
+      <w:r>
+        <w:t xml:space="preserve"> </w:t>
+      </w:r>
+      <w:r>
+        <w:rPr>
+          <w:i/>
+          <w:iCs/>
+        </w:rPr>
+        <w:t xml:space="preserve">(Which keywords/phrases produced the results you wanted? What did the AI interpret correctly?):</w:t>
+      </w:r>
+    </w:p>
     <w:p>
       <w:r>
         <w:pict>
@@ -2971,26 +3033,6 @@
         </w:pict>
       </w:r>
     </w:p>
-    <w:bookmarkEnd w:id="20"/>
-    <w:bookmarkEnd w:id="21"/>
-    <w:bookmarkStart w:id="25" w:name="song-a-round-2-targeted-refinement"/>
-    <w:p>
-      <w:pPr>
-        <w:pStyle w:val="Heading3"/>
-      </w:pPr>
-      <w:r>
-        <w:t xml:space="preserve">Song A — Round 2 (Targeted Refinement)</w:t>
-      </w:r>
-    </w:p>
-    <w:bookmarkStart w:id="22" w:name="reflection-on-round-1"/>
-    <w:p>
-      <w:pPr>
-        <w:pStyle w:val="Heading4"/>
-      </w:pPr>
-      <w:r>
-        <w:t xml:space="preserve">Reflection on Round 1</w:t>
-      </w:r>
-    </w:p>
     <w:p>
       <w:pPr>
         <w:pStyle w:val="FirstParagraph"/>
@@ -3000,7 +3042,7 @@
           <w:b/>
           <w:bCs/>
         </w:rPr>
-        <w:t xml:space="preserve">Strengths from Round 1</w:t>
+        <w:t xml:space="preserve">What didn’t work in the prompt</w:t>
       </w:r>
       <w:r>
         <w:t xml:space="preserve"> </w:t>
@@ -3010,7 +3052,7 @@
           <w:i/>
           <w:iCs/>
         </w:rPr>
-        <w:t xml:space="preserve">(What worked well? Which rubric categories scored highest and why?):</w:t>
+        <w:t xml:space="preserve">(Which keywords/phrases were ignored, misinterpreted, or had no effect? What was missing?):</w:t>
       </w:r>
     </w:p>
     <w:p>
@@ -3021,28 +3063,6 @@
       </w:r>
     </w:p>
     <w:p>
-      <w:pPr>
-        <w:pStyle w:val="FirstParagraph"/>
-      </w:pPr>
-      <w:r>
-        <w:rPr>
-          <w:b/>
-          <w:bCs/>
-        </w:rPr>
-        <w:t xml:space="preserve">Weaknesses from Round 1</w:t>
-      </w:r>
-      <w:r>
-        <w:t xml:space="preserve"> </w:t>
-      </w:r>
-      <w:r>
-        <w:rPr>
-          <w:i/>
-          <w:iCs/>
-        </w:rPr>
-        <w:t xml:space="preserve">(What fell short? Which rubric categories scored lowest and why?):</w:t>
-      </w:r>
-    </w:p>
-    <w:p>
       <w:r>
         <w:pict>
           <v:rect style="width:0;height:1.5pt" o:hralign="center" o:hrstd="t" o:hr="t"/>
@@ -3050,13 +3070,23 @@
       </w:r>
     </w:p>
     <w:bookmarkEnd w:id="22"/>
-    <w:bookmarkStart w:id="23" w:name="prompt-revision-reasoning"/>
+    <w:bookmarkEnd w:id="23"/>
+    <w:bookmarkStart w:id="29" w:name="song-a-round-2-targeted-refinement"/>
+    <w:p>
+      <w:pPr>
+        <w:pStyle w:val="Heading3"/>
+      </w:pPr>
+      <w:r>
+        <w:t xml:space="preserve">Song A — Round 2 (Targeted Refinement)</w:t>
+      </w:r>
+    </w:p>
+    <w:bookmarkStart w:id="24" w:name="reflection-on-round-1"/>
     <w:p>
       <w:pPr>
         <w:pStyle w:val="Heading4"/>
       </w:pPr>
       <w:r>
-        <w:t xml:space="preserve">Prompt Revision Reasoning</w:t>
+        <w:t xml:space="preserve">Reflection on Round 1</w:t>
       </w:r>
     </w:p>
     <w:p>
@@ -3068,7 +3098,75 @@
           <w:b/>
           <w:bCs/>
         </w:rPr>
-        <w:t xml:space="preserve">Specific prompt elements you changed, added, or deleted:</w:t>
+        <w:t xml:space="preserve">Song issues to fix</w:t>
+      </w:r>
+      <w:r>
+        <w:t xml:space="preserve"> </w:t>
+      </w:r>
+      <w:r>
+        <w:rPr>
+          <w:i/>
+          <w:iCs/>
+        </w:rPr>
+        <w:t xml:space="preserve">(Based on your Round 1 rubric scores, which 2-3 musical weaknesses are you targeting?):</w:t>
+      </w:r>
+    </w:p>
+    <w:p>
+      <w:r>
+        <w:pict>
+          <v:rect style="width:0;height:1.5pt" o:hralign="center" o:hrstd="t" o:hr="t"/>
+        </w:pict>
+      </w:r>
+    </w:p>
+    <w:p>
+      <w:pPr>
+        <w:pStyle w:val="FirstParagraph"/>
+      </w:pPr>
+      <w:r>
+        <w:rPr>
+          <w:b/>
+          <w:bCs/>
+        </w:rPr>
+        <w:t xml:space="preserve">Prompt issues to fix</w:t>
+      </w:r>
+      <w:r>
+        <w:t xml:space="preserve"> </w:t>
+      </w:r>
+      <w:r>
+        <w:rPr>
+          <w:i/>
+          <w:iCs/>
+        </w:rPr>
+        <w:t xml:space="preserve">(Based on your Round 1 prompt evaluation, which words/phrases failed and need to be reworked?):</w:t>
+      </w:r>
+    </w:p>
+    <w:p>
+      <w:r>
+        <w:pict>
+          <v:rect style="width:0;height:1.5pt" o:hralign="center" o:hrstd="t" o:hr="t"/>
+        </w:pict>
+      </w:r>
+    </w:p>
+    <w:bookmarkEnd w:id="24"/>
+    <w:bookmarkStart w:id="25" w:name="prompt-revision-reasoning"/>
+    <w:p>
+      <w:pPr>
+        <w:pStyle w:val="Heading4"/>
+      </w:pPr>
+      <w:r>
+        <w:t xml:space="preserve">Prompt Revision Reasoning</w:t>
+      </w:r>
+    </w:p>
+    <w:p>
+      <w:pPr>
+        <w:pStyle w:val="FirstParagraph"/>
+      </w:pPr>
+      <w:r>
+        <w:rPr>
+          <w:b/>
+          <w:bCs/>
+        </w:rPr>
+        <w:t xml:space="preserve">Specific prompt elements you changed, added, or deleted to address the above:</w:t>
       </w:r>
     </w:p>
     <w:tbl>
@@ -3079,9 +3177,10 @@
         <w:tblLook w:firstRow="1" w:lastRow="0" w:firstColumn="0" w:lastColumn="0" w:noHBand="0" w:noVBand="0" w:val="0020"/>
       </w:tblPr>
       <w:tblGrid>
-        <w:gridCol w:w="1240"/>
-        <w:gridCol w:w="2958"/>
-        <w:gridCol w:w="3721"/>
+        <w:gridCol w:w="1040"/>
+        <w:gridCol w:w="3040"/>
+        <w:gridCol w:w="2960"/>
+        <w:gridCol w:w="880"/>
       </w:tblGrid>
       <w:tr>
         <w:trPr>
@@ -3106,18 +3205,29 @@
               <w:pStyle w:val="Compact"/>
             </w:pPr>
             <w:r>
-              <w:t xml:space="preserve">What You Changed in the Prompt</w:t>
-            </w:r>
-          </w:p>
-        </w:tc>
-        <w:tc>
-          <w:tcPr/>
-          <w:p>
-            <w:pPr>
-              <w:pStyle w:val="Compact"/>
-            </w:pPr>
-            <w:r>
-              <w:t xml:space="preserve">Which Strength/Weakness This Addresses</w:t>
+              <w:t xml:space="preserve">Exact Words/Phrases Changed in Prompt</w:t>
+            </w:r>
+          </w:p>
+        </w:tc>
+        <w:tc>
+          <w:tcPr/>
+          <w:p>
+            <w:pPr>
+              <w:pStyle w:val="Compact"/>
+            </w:pPr>
+            <w:r>
+              <w:t xml:space="preserve">Song or Prompt Issue This Addresses</w:t>
+            </w:r>
+          </w:p>
+        </w:tc>
+        <w:tc>
+          <w:tcPr/>
+          <w:p>
+            <w:pPr>
+              <w:pStyle w:val="Compact"/>
+            </w:pPr>
+            <w:r>
+              <w:t xml:space="preserve">Reasoning</w:t>
             </w:r>
           </w:p>
         </w:tc>
@@ -3151,6 +3261,14 @@
             </w:pPr>
           </w:p>
         </w:tc>
+        <w:tc>
+          <w:tcPr/>
+          <w:p>
+            <w:pPr>
+              <w:pStyle w:val="Compact"/>
+            </w:pPr>
+          </w:p>
+        </w:tc>
       </w:tr>
       <w:tr>
         <w:tc>
@@ -3181,6 +3299,14 @@
             </w:pPr>
           </w:p>
         </w:tc>
+        <w:tc>
+          <w:tcPr/>
+          <w:p>
+            <w:pPr>
+              <w:pStyle w:val="Compact"/>
+            </w:pPr>
+          </w:p>
+        </w:tc>
       </w:tr>
       <w:tr>
         <w:tc>
@@ -3193,6 +3319,14 @@
             <w:r>
               <w:t xml:space="preserve">Deleted</w:t>
             </w:r>
+          </w:p>
+        </w:tc>
+        <w:tc>
+          <w:tcPr/>
+          <w:p>
+            <w:pPr>
+              <w:pStyle w:val="Compact"/>
+            </w:pPr>
           </w:p>
         </w:tc>
         <w:tc>
@@ -3222,14 +3356,28 @@
           <w:b/>
           <w:bCs/>
         </w:rPr>
-        <w:t xml:space="preserve">Why you believe these changes will improve the output:</w:t>
-      </w:r>
-    </w:p>
-    <w:p>
-      <w:r>
-        <w:pict>
-          <v:rect style="width:0;height:1.5pt" o:hralign="center" o:hrstd="t" o:hr="t"/>
-        </w:pict>
+        <w:t xml:space="preserve">Prompt Used</w:t>
+      </w:r>
+      <w:r>
+        <w:t xml:space="preserve"> </w:t>
+      </w:r>
+      <w:r>
+        <w:rPr>
+          <w:i/>
+          <w:iCs/>
+        </w:rPr>
+        <w:t xml:space="preserve">(verbatim):</w:t>
+      </w:r>
+    </w:p>
+    <w:p>
+      <w:pPr>
+        <w:pStyle w:val="SourceCode"/>
+      </w:pPr>
+      <w:r>
+        <w:rPr>
+          <w:rStyle w:val="VerbatimChar"/>
+        </w:rPr>
+        <w:t xml:space="preserve">[paste your exact prompt here]</w:t>
       </w:r>
     </w:p>
     <w:p>
@@ -3241,7 +3389,7 @@
           <w:b/>
           <w:bCs/>
         </w:rPr>
-        <w:t xml:space="preserve">Prompt Used</w:t>
+        <w:t xml:space="preserve">Refinement Strategy Used</w:t>
       </w:r>
       <w:r>
         <w:t xml:space="preserve"> </w:t>
@@ -3251,113 +3399,80 @@
           <w:i/>
           <w:iCs/>
         </w:rPr>
-        <w:t xml:space="preserve">(verbatim):</w:t>
-      </w:r>
-    </w:p>
-    <w:p>
-      <w:pPr>
-        <w:pStyle w:val="SourceCode"/>
-      </w:pPr>
-      <w:r>
-        <w:rPr>
-          <w:rStyle w:val="VerbatimChar"/>
-        </w:rPr>
-        <w:t xml:space="preserve">[paste your exact prompt here]</w:t>
-      </w:r>
-    </w:p>
-    <w:p>
-      <w:pPr>
-        <w:pStyle w:val="FirstParagraph"/>
+        <w:t xml:space="preserve">(check all that apply):</w:t>
+      </w:r>
+      <w:r>
+        <w:t xml:space="preserve"> </w:t>
+      </w:r>
+      <w:r>
+        <w:t xml:space="preserve">- [ ] Technical specificity</w:t>
+      </w:r>
+      <w:r>
+        <w:t xml:space="preserve"> </w:t>
+      </w:r>
+      <w:r>
+        <w:t xml:space="preserve">- [ ] Reference enhancement</w:t>
+      </w:r>
+      <w:r>
+        <w:t xml:space="preserve"> </w:t>
+      </w:r>
+      <w:r>
+        <w:t xml:space="preserve">- [ ] Emotional elaboration</w:t>
+      </w:r>
+      <w:r>
+        <w:t xml:space="preserve"> </w:t>
+      </w:r>
+      <w:r>
+        <w:t xml:space="preserve">- [ ] Constraint adjustment</w:t>
+      </w:r>
+      <w:r>
+        <w:t xml:space="preserve"> </w:t>
+      </w:r>
+      <w:r>
+        <w:t xml:space="preserve">- [ ] Cultural contextualization</w:t>
+      </w:r>
+      <w:r>
+        <w:t xml:space="preserve"> </w:t>
+      </w:r>
+      <w:r>
+        <w:t xml:space="preserve">- [ ] Feedback incorporation</w:t>
+      </w:r>
+      <w:r>
+        <w:t xml:space="preserve"> </w:t>
+      </w:r>
+      <w:r>
+        <w:t xml:space="preserve">- [ ] Prompt restructuring</w:t>
+      </w:r>
+      <w:r>
+        <w:t xml:space="preserve"> </w:t>
+      </w:r>
+      <w:r>
+        <w:t xml:space="preserve">- [ ] Length modification</w:t>
+      </w:r>
+    </w:p>
+    <w:p>
+      <w:pPr>
+        <w:pStyle w:val="BodyText"/>
       </w:pPr>
       <w:r>
         <w:rPr>
           <w:b/>
           <w:bCs/>
         </w:rPr>
-        <w:t xml:space="preserve">Refinement Strategy Used</w:t>
+        <w:t xml:space="preserve">Audio File:</w:t>
       </w:r>
       <w:r>
         <w:t xml:space="preserve"> </w:t>
       </w:r>
       <w:r>
         <w:rPr>
-          <w:i/>
-          <w:iCs/>
-        </w:rPr>
-        <w:t xml:space="preserve">(check all that apply):</w:t>
-      </w:r>
-      <w:r>
-        <w:t xml:space="preserve"> </w:t>
-      </w:r>
-      <w:r>
-        <w:t xml:space="preserve">- [ ] Technical specificity</w:t>
-      </w:r>
-      <w:r>
-        <w:t xml:space="preserve"> </w:t>
-      </w:r>
-      <w:r>
-        <w:t xml:space="preserve">- [ ] Reference enhancement</w:t>
-      </w:r>
-      <w:r>
-        <w:t xml:space="preserve"> </w:t>
-      </w:r>
-      <w:r>
-        <w:t xml:space="preserve">- [ ] Emotional elaboration</w:t>
-      </w:r>
-      <w:r>
-        <w:t xml:space="preserve"> </w:t>
-      </w:r>
-      <w:r>
-        <w:t xml:space="preserve">- [ ] Constraint adjustment</w:t>
-      </w:r>
-      <w:r>
-        <w:t xml:space="preserve"> </w:t>
-      </w:r>
-      <w:r>
-        <w:t xml:space="preserve">- [ ] Cultural contextualization</w:t>
-      </w:r>
-      <w:r>
-        <w:t xml:space="preserve"> </w:t>
-      </w:r>
-      <w:r>
-        <w:t xml:space="preserve">- [ ] Feedback incorporation</w:t>
-      </w:r>
-      <w:r>
-        <w:t xml:space="preserve"> </w:t>
-      </w:r>
-      <w:r>
-        <w:t xml:space="preserve">- [ ] Prompt restructuring</w:t>
-      </w:r>
-      <w:r>
-        <w:t xml:space="preserve"> </w:t>
-      </w:r>
-      <w:r>
-        <w:t xml:space="preserve">- [ ] Length modification</w:t>
-      </w:r>
-    </w:p>
-    <w:p>
-      <w:pPr>
-        <w:pStyle w:val="BodyText"/>
-      </w:pPr>
-      <w:r>
-        <w:rPr>
-          <w:b/>
-          <w:bCs/>
-        </w:rPr>
-        <w:t xml:space="preserve">Audio File:</w:t>
-      </w:r>
-      <w:r>
-        <w:t xml:space="preserve"> </w:t>
-      </w:r>
-      <w:r>
-        <w:rPr>
           <w:rStyle w:val="VerbatimChar"/>
         </w:rPr>
         <w:t xml:space="preserve">SongA_Round2.mp3</w:t>
       </w:r>
     </w:p>
-    <w:bookmarkEnd w:id="23"/>
-    <w:bookmarkStart w:id="24" w:name="harmonic-rubric-song-a-round-2"/>
+    <w:bookmarkEnd w:id="25"/>
+    <w:bookmarkStart w:id="26" w:name="harmonic-rubric-song-a-round-2"/>
     <w:p>
       <w:pPr>
         <w:pStyle w:val="Heading4"/>
@@ -5404,16 +5519,36 @@
         <w:t xml:space="preserve">Composite Score: _____ / 100</w:t>
       </w:r>
     </w:p>
-    <w:p>
-      <w:pPr>
-        <w:pStyle w:val="BodyText"/>
+    <w:bookmarkEnd w:id="26"/>
+    <w:bookmarkStart w:id="27" w:name="song-evaluation-1"/>
+    <w:p>
+      <w:pPr>
+        <w:pStyle w:val="Heading4"/>
+      </w:pPr>
+      <w:r>
+        <w:t xml:space="preserve">Song Evaluation</w:t>
+      </w:r>
+    </w:p>
+    <w:p>
+      <w:pPr>
+        <w:pStyle w:val="FirstParagraph"/>
       </w:pPr>
       <w:r>
         <w:rPr>
           <w:b/>
           <w:bCs/>
         </w:rPr>
-        <w:t xml:space="preserve">Strengths:</w:t>
+        <w:t xml:space="preserve">Song Strengths</w:t>
+      </w:r>
+      <w:r>
+        <w:t xml:space="preserve"> </w:t>
+      </w:r>
+      <w:r>
+        <w:rPr>
+          <w:i/>
+          <w:iCs/>
+        </w:rPr>
+        <w:t xml:space="preserve">(What sounds good? Cite specific musical moments — e.g., melody, rhythm, production, emotional impact, genre authenticity):</w:t>
       </w:r>
     </w:p>
     <w:p>
@@ -5432,7 +5567,17 @@
           <w:b/>
           <w:bCs/>
         </w:rPr>
-        <w:t xml:space="preserve">Weaknesses:</w:t>
+        <w:t xml:space="preserve">Song Weaknesses</w:t>
+      </w:r>
+      <w:r>
+        <w:t xml:space="preserve"> </w:t>
+      </w:r>
+      <w:r>
+        <w:rPr>
+          <w:i/>
+          <w:iCs/>
+        </w:rPr>
+        <w:t xml:space="preserve">(What sounds wrong or weak? Cite specific musical problems — e.g., artifacts, wrong instruments, weak structure, missing emotion):</w:t>
       </w:r>
     </w:p>
     <w:p>
@@ -5451,7 +5596,7 @@
           <w:b/>
           <w:bCs/>
         </w:rPr>
-        <w:t xml:space="preserve">What Improved from Round 1:</w:t>
+        <w:t xml:space="preserve">What improved in the song from Round 1:</w:t>
       </w:r>
     </w:p>
     <w:p>
@@ -5461,6 +5606,38 @@
         </w:pict>
       </w:r>
     </w:p>
+    <w:bookmarkEnd w:id="27"/>
+    <w:bookmarkStart w:id="28" w:name="prompt-evaluation-1"/>
+    <w:p>
+      <w:pPr>
+        <w:pStyle w:val="Heading4"/>
+      </w:pPr>
+      <w:r>
+        <w:t xml:space="preserve">Prompt Evaluation</w:t>
+      </w:r>
+    </w:p>
+    <w:p>
+      <w:pPr>
+        <w:pStyle w:val="FirstParagraph"/>
+      </w:pPr>
+      <w:r>
+        <w:rPr>
+          <w:b/>
+          <w:bCs/>
+        </w:rPr>
+        <w:t xml:space="preserve">What worked in the prompt</w:t>
+      </w:r>
+      <w:r>
+        <w:t xml:space="preserve"> </w:t>
+      </w:r>
+      <w:r>
+        <w:rPr>
+          <w:i/>
+          <w:iCs/>
+        </w:rPr>
+        <w:t xml:space="preserve">(Which keywords/phrases produced the results you wanted? What did the AI interpret correctly?):</w:t>
+      </w:r>
+    </w:p>
     <w:p>
       <w:r>
         <w:pict>
@@ -5468,26 +5645,6 @@
         </w:pict>
       </w:r>
     </w:p>
-    <w:bookmarkEnd w:id="24"/>
-    <w:bookmarkEnd w:id="25"/>
-    <w:bookmarkStart w:id="29" w:name="song-a-round-3-fine-tuning"/>
-    <w:p>
-      <w:pPr>
-        <w:pStyle w:val="Heading3"/>
-      </w:pPr>
-      <w:r>
-        <w:t xml:space="preserve">Song A — Round 3 (Fine-Tuning)</w:t>
-      </w:r>
-    </w:p>
-    <w:bookmarkStart w:id="26" w:name="reflection-on-rounds-1-and-2"/>
-    <w:p>
-      <w:pPr>
-        <w:pStyle w:val="Heading4"/>
-      </w:pPr>
-      <w:r>
-        <w:t xml:space="preserve">Reflection on Rounds 1 and 2</w:t>
-      </w:r>
-    </w:p>
     <w:p>
       <w:pPr>
         <w:pStyle w:val="FirstParagraph"/>
@@ -5497,7 +5654,7 @@
           <w:b/>
           <w:bCs/>
         </w:rPr>
-        <w:t xml:space="preserve">Strengths from Round 2</w:t>
+        <w:t xml:space="preserve">What didn’t work in the prompt</w:t>
       </w:r>
       <w:r>
         <w:t xml:space="preserve"> </w:t>
@@ -5507,7 +5664,7 @@
           <w:i/>
           <w:iCs/>
         </w:rPr>
-        <w:t xml:space="preserve">(What improved from Round 1? What new strengths emerged?):</w:t>
+        <w:t xml:space="preserve">(Which keywords/phrases were ignored, misinterpreted, or had no effect? What was missing?):</w:t>
       </w:r>
     </w:p>
     <w:p>
@@ -5518,34 +5675,32 @@
       </w:r>
     </w:p>
     <w:p>
-      <w:pPr>
-        <w:pStyle w:val="FirstParagraph"/>
-      </w:pPr>
-      <w:r>
-        <w:rPr>
-          <w:b/>
-          <w:bCs/>
-        </w:rPr>
-        <w:t xml:space="preserve">Remaining weaknesses</w:t>
-      </w:r>
-      <w:r>
-        <w:t xml:space="preserve"> </w:t>
-      </w:r>
-      <w:r>
-        <w:rPr>
-          <w:i/>
-          <w:iCs/>
-        </w:rPr>
-        <w:t xml:space="preserve">(What issues persisted or appeared despite Round 2 refinements?):</w:t>
-      </w:r>
-    </w:p>
-    <w:p>
       <w:r>
         <w:pict>
           <v:rect style="width:0;height:1.5pt" o:hralign="center" o:hrstd="t" o:hr="t"/>
         </w:pict>
       </w:r>
     </w:p>
+    <w:bookmarkEnd w:id="28"/>
+    <w:bookmarkEnd w:id="29"/>
+    <w:bookmarkStart w:id="35" w:name="song-a-round-3-fine-tuning"/>
+    <w:p>
+      <w:pPr>
+        <w:pStyle w:val="Heading3"/>
+      </w:pPr>
+      <w:r>
+        <w:t xml:space="preserve">Song A — Round 3 (Fine-Tuning)</w:t>
+      </w:r>
+    </w:p>
+    <w:bookmarkStart w:id="30" w:name="reflection-on-rounds-1-and-2"/>
+    <w:p>
+      <w:pPr>
+        <w:pStyle w:val="Heading4"/>
+      </w:pPr>
+      <w:r>
+        <w:t xml:space="preserve">Reflection on Rounds 1 and 2</w:t>
+      </w:r>
+    </w:p>
     <w:p>
       <w:pPr>
         <w:pStyle w:val="FirstParagraph"/>
@@ -5555,7 +5710,7 @@
           <w:b/>
           <w:bCs/>
         </w:rPr>
-        <w:t xml:space="preserve">Assessment of Round 2 refinement strategy</w:t>
+        <w:t xml:space="preserve">Song issues to fix</w:t>
       </w:r>
       <w:r>
         <w:t xml:space="preserve"> </w:t>
@@ -5565,7 +5720,7 @@
           <w:i/>
           <w:iCs/>
         </w:rPr>
-        <w:t xml:space="preserve">(Was your targeted refinement effective? Did addressing the weaknesses you identified actually improve those rubric scores?):</w:t>
+        <w:t xml:space="preserve">(Based on your Round 2 rubric scores, which musical weaknesses remain or emerged? Did Round 2 fixes actually improve those scores?):</w:t>
       </w:r>
     </w:p>
     <w:p>
@@ -5575,16 +5730,6 @@
         </w:pict>
       </w:r>
     </w:p>
-    <w:bookmarkEnd w:id="26"/>
-    <w:bookmarkStart w:id="27" w:name="prompt-revision-reasoning-1"/>
-    <w:p>
-      <w:pPr>
-        <w:pStyle w:val="Heading4"/>
-      </w:pPr>
-      <w:r>
-        <w:t xml:space="preserve">Prompt Revision Reasoning</w:t>
-      </w:r>
-    </w:p>
     <w:p>
       <w:pPr>
         <w:pStyle w:val="FirstParagraph"/>
@@ -5594,7 +5739,75 @@
           <w:b/>
           <w:bCs/>
         </w:rPr>
-        <w:t xml:space="preserve">Specific prompt elements you changed, added, or deleted:</w:t>
+        <w:t xml:space="preserve">Prompt issues to fix</w:t>
+      </w:r>
+      <w:r>
+        <w:t xml:space="preserve"> </w:t>
+      </w:r>
+      <w:r>
+        <w:rPr>
+          <w:i/>
+          <w:iCs/>
+        </w:rPr>
+        <w:t xml:space="preserve">(Which prompt words/phrases still aren’t working? What was misinterpreted or ignored in Round 2?):</w:t>
+      </w:r>
+    </w:p>
+    <w:p>
+      <w:r>
+        <w:pict>
+          <v:rect style="width:0;height:1.5pt" o:hralign="center" o:hrstd="t" o:hr="t"/>
+        </w:pict>
+      </w:r>
+    </w:p>
+    <w:p>
+      <w:pPr>
+        <w:pStyle w:val="FirstParagraph"/>
+      </w:pPr>
+      <w:r>
+        <w:rPr>
+          <w:b/>
+          <w:bCs/>
+        </w:rPr>
+        <w:t xml:space="preserve">Assessment of Round 2 refinement strategy</w:t>
+      </w:r>
+      <w:r>
+        <w:t xml:space="preserve"> </w:t>
+      </w:r>
+      <w:r>
+        <w:rPr>
+          <w:i/>
+          <w:iCs/>
+        </w:rPr>
+        <w:t xml:space="preserve">(Was your targeted refinement effective? Which prompt changes worked and which didn’t?):</w:t>
+      </w:r>
+    </w:p>
+    <w:p>
+      <w:r>
+        <w:pict>
+          <v:rect style="width:0;height:1.5pt" o:hralign="center" o:hrstd="t" o:hr="t"/>
+        </w:pict>
+      </w:r>
+    </w:p>
+    <w:bookmarkEnd w:id="30"/>
+    <w:bookmarkStart w:id="31" w:name="prompt-revision-reasoning-1"/>
+    <w:p>
+      <w:pPr>
+        <w:pStyle w:val="Heading4"/>
+      </w:pPr>
+      <w:r>
+        <w:t xml:space="preserve">Prompt Revision Reasoning</w:t>
+      </w:r>
+    </w:p>
+    <w:p>
+      <w:pPr>
+        <w:pStyle w:val="FirstParagraph"/>
+      </w:pPr>
+      <w:r>
+        <w:rPr>
+          <w:b/>
+          <w:bCs/>
+        </w:rPr>
+        <w:t xml:space="preserve">Specific prompt elements you changed, added, or deleted to address the above:</w:t>
       </w:r>
     </w:p>
     <w:tbl>
@@ -5605,9 +5818,10 @@
         <w:tblLook w:firstRow="1" w:lastRow="0" w:firstColumn="0" w:lastColumn="0" w:noHBand="0" w:noVBand="0" w:val="0020"/>
       </w:tblPr>
       <w:tblGrid>
-        <w:gridCol w:w="1240"/>
-        <w:gridCol w:w="2958"/>
-        <w:gridCol w:w="3721"/>
+        <w:gridCol w:w="1040"/>
+        <w:gridCol w:w="3040"/>
+        <w:gridCol w:w="2960"/>
+        <w:gridCol w:w="880"/>
       </w:tblGrid>
       <w:tr>
         <w:trPr>
@@ -5632,18 +5846,29 @@
               <w:pStyle w:val="Compact"/>
             </w:pPr>
             <w:r>
-              <w:t xml:space="preserve">What You Changed in the Prompt</w:t>
-            </w:r>
-          </w:p>
-        </w:tc>
-        <w:tc>
-          <w:tcPr/>
-          <w:p>
-            <w:pPr>
-              <w:pStyle w:val="Compact"/>
-            </w:pPr>
-            <w:r>
-              <w:t xml:space="preserve">Which Strength/Weakness This Addresses</w:t>
+              <w:t xml:space="preserve">Exact Words/Phrases Changed in Prompt</w:t>
+            </w:r>
+          </w:p>
+        </w:tc>
+        <w:tc>
+          <w:tcPr/>
+          <w:p>
+            <w:pPr>
+              <w:pStyle w:val="Compact"/>
+            </w:pPr>
+            <w:r>
+              <w:t xml:space="preserve">Song or Prompt Issue This Addresses</w:t>
+            </w:r>
+          </w:p>
+        </w:tc>
+        <w:tc>
+          <w:tcPr/>
+          <w:p>
+            <w:pPr>
+              <w:pStyle w:val="Compact"/>
+            </w:pPr>
+            <w:r>
+              <w:t xml:space="preserve">Reasoning</w:t>
             </w:r>
           </w:p>
         </w:tc>
@@ -5677,6 +5902,14 @@
             </w:pPr>
           </w:p>
         </w:tc>
+        <w:tc>
+          <w:tcPr/>
+          <w:p>
+            <w:pPr>
+              <w:pStyle w:val="Compact"/>
+            </w:pPr>
+          </w:p>
+        </w:tc>
       </w:tr>
       <w:tr>
         <w:tc>
@@ -5707,6 +5940,14 @@
             </w:pPr>
           </w:p>
         </w:tc>
+        <w:tc>
+          <w:tcPr/>
+          <w:p>
+            <w:pPr>
+              <w:pStyle w:val="Compact"/>
+            </w:pPr>
+          </w:p>
+        </w:tc>
       </w:tr>
       <w:tr>
         <w:tc>
@@ -5719,6 +5960,14 @@
             <w:r>
               <w:t xml:space="preserve">Deleted</w:t>
             </w:r>
+          </w:p>
+        </w:tc>
+        <w:tc>
+          <w:tcPr/>
+          <w:p>
+            <w:pPr>
+              <w:pStyle w:val="Compact"/>
+            </w:pPr>
           </w:p>
         </w:tc>
         <w:tc>
@@ -5748,14 +5997,28 @@
           <w:b/>
           <w:bCs/>
         </w:rPr>
-        <w:t xml:space="preserve">Why you believe these changes will improve the output:</w:t>
-      </w:r>
-    </w:p>
-    <w:p>
-      <w:r>
-        <w:pict>
-          <v:rect style="width:0;height:1.5pt" o:hralign="center" o:hrstd="t" o:hr="t"/>
-        </w:pict>
+        <w:t xml:space="preserve">Prompt Used</w:t>
+      </w:r>
+      <w:r>
+        <w:t xml:space="preserve"> </w:t>
+      </w:r>
+      <w:r>
+        <w:rPr>
+          <w:i/>
+          <w:iCs/>
+        </w:rPr>
+        <w:t xml:space="preserve">(verbatim):</w:t>
+      </w:r>
+    </w:p>
+    <w:p>
+      <w:pPr>
+        <w:pStyle w:val="SourceCode"/>
+      </w:pPr>
+      <w:r>
+        <w:rPr>
+          <w:rStyle w:val="VerbatimChar"/>
+        </w:rPr>
+        <w:t xml:space="preserve">[paste your exact prompt here]</w:t>
       </w:r>
     </w:p>
     <w:p>
@@ -5767,7 +6030,7 @@
           <w:b/>
           <w:bCs/>
         </w:rPr>
-        <w:t xml:space="preserve">Prompt Used</w:t>
+        <w:t xml:space="preserve">Refinement Strategy Used</w:t>
       </w:r>
       <w:r>
         <w:t xml:space="preserve"> </w:t>
@@ -5777,113 +6040,80 @@
           <w:i/>
           <w:iCs/>
         </w:rPr>
-        <w:t xml:space="preserve">(verbatim):</w:t>
-      </w:r>
-    </w:p>
-    <w:p>
-      <w:pPr>
-        <w:pStyle w:val="SourceCode"/>
-      </w:pPr>
-      <w:r>
-        <w:rPr>
-          <w:rStyle w:val="VerbatimChar"/>
-        </w:rPr>
-        <w:t xml:space="preserve">[paste your exact prompt here]</w:t>
-      </w:r>
-    </w:p>
-    <w:p>
-      <w:pPr>
-        <w:pStyle w:val="FirstParagraph"/>
+        <w:t xml:space="preserve">(check all that apply):</w:t>
+      </w:r>
+      <w:r>
+        <w:t xml:space="preserve"> </w:t>
+      </w:r>
+      <w:r>
+        <w:t xml:space="preserve">- [ ] Technical specificity</w:t>
+      </w:r>
+      <w:r>
+        <w:t xml:space="preserve"> </w:t>
+      </w:r>
+      <w:r>
+        <w:t xml:space="preserve">- [ ] Reference enhancement</w:t>
+      </w:r>
+      <w:r>
+        <w:t xml:space="preserve"> </w:t>
+      </w:r>
+      <w:r>
+        <w:t xml:space="preserve">- [ ] Emotional elaboration</w:t>
+      </w:r>
+      <w:r>
+        <w:t xml:space="preserve"> </w:t>
+      </w:r>
+      <w:r>
+        <w:t xml:space="preserve">- [ ] Constraint adjustment</w:t>
+      </w:r>
+      <w:r>
+        <w:t xml:space="preserve"> </w:t>
+      </w:r>
+      <w:r>
+        <w:t xml:space="preserve">- [ ] Cultural contextualization</w:t>
+      </w:r>
+      <w:r>
+        <w:t xml:space="preserve"> </w:t>
+      </w:r>
+      <w:r>
+        <w:t xml:space="preserve">- [ ] Feedback incorporation</w:t>
+      </w:r>
+      <w:r>
+        <w:t xml:space="preserve"> </w:t>
+      </w:r>
+      <w:r>
+        <w:t xml:space="preserve">- [ ] Prompt restructuring</w:t>
+      </w:r>
+      <w:r>
+        <w:t xml:space="preserve"> </w:t>
+      </w:r>
+      <w:r>
+        <w:t xml:space="preserve">- [ ] Length modification</w:t>
+      </w:r>
+    </w:p>
+    <w:p>
+      <w:pPr>
+        <w:pStyle w:val="BodyText"/>
       </w:pPr>
       <w:r>
         <w:rPr>
           <w:b/>
           <w:bCs/>
         </w:rPr>
-        <w:t xml:space="preserve">Refinement Strategy Used</w:t>
+        <w:t xml:space="preserve">Audio File:</w:t>
       </w:r>
       <w:r>
         <w:t xml:space="preserve"> </w:t>
       </w:r>
       <w:r>
         <w:rPr>
-          <w:i/>
-          <w:iCs/>
-        </w:rPr>
-        <w:t xml:space="preserve">(check all that apply):</w:t>
-      </w:r>
-      <w:r>
-        <w:t xml:space="preserve"> </w:t>
-      </w:r>
-      <w:r>
-        <w:t xml:space="preserve">- [ ] Technical specificity</w:t>
-      </w:r>
-      <w:r>
-        <w:t xml:space="preserve"> </w:t>
-      </w:r>
-      <w:r>
-        <w:t xml:space="preserve">- [ ] Reference enhancement</w:t>
-      </w:r>
-      <w:r>
-        <w:t xml:space="preserve"> </w:t>
-      </w:r>
-      <w:r>
-        <w:t xml:space="preserve">- [ ] Emotional elaboration</w:t>
-      </w:r>
-      <w:r>
-        <w:t xml:space="preserve"> </w:t>
-      </w:r>
-      <w:r>
-        <w:t xml:space="preserve">- [ ] Constraint adjustment</w:t>
-      </w:r>
-      <w:r>
-        <w:t xml:space="preserve"> </w:t>
-      </w:r>
-      <w:r>
-        <w:t xml:space="preserve">- [ ] Cultural contextualization</w:t>
-      </w:r>
-      <w:r>
-        <w:t xml:space="preserve"> </w:t>
-      </w:r>
-      <w:r>
-        <w:t xml:space="preserve">- [ ] Feedback incorporation</w:t>
-      </w:r>
-      <w:r>
-        <w:t xml:space="preserve"> </w:t>
-      </w:r>
-      <w:r>
-        <w:t xml:space="preserve">- [ ] Prompt restructuring</w:t>
-      </w:r>
-      <w:r>
-        <w:t xml:space="preserve"> </w:t>
-      </w:r>
-      <w:r>
-        <w:t xml:space="preserve">- [ ] Length modification</w:t>
-      </w:r>
-    </w:p>
-    <w:p>
-      <w:pPr>
-        <w:pStyle w:val="BodyText"/>
-      </w:pPr>
-      <w:r>
-        <w:rPr>
-          <w:b/>
-          <w:bCs/>
-        </w:rPr>
-        <w:t xml:space="preserve">Audio File:</w:t>
-      </w:r>
-      <w:r>
-        <w:t xml:space="preserve"> </w:t>
-      </w:r>
-      <w:r>
-        <w:rPr>
           <w:rStyle w:val="VerbatimChar"/>
         </w:rPr>
         <w:t xml:space="preserve">SongA_Round3.mp3</w:t>
       </w:r>
     </w:p>
-    <w:bookmarkEnd w:id="27"/>
-    <w:bookmarkStart w:id="28" w:name="harmonic-rubric-song-a-round-3"/>
+    <w:bookmarkEnd w:id="31"/>
+    <w:bookmarkStart w:id="32" w:name="harmonic-rubric-song-a-round-3"/>
     <w:p>
       <w:pPr>
         <w:pStyle w:val="Heading4"/>
@@ -7930,16 +8160,36 @@
         <w:t xml:space="preserve">Composite Score: _____ / 100</w:t>
       </w:r>
     </w:p>
-    <w:p>
-      <w:pPr>
-        <w:pStyle w:val="BodyText"/>
+    <w:bookmarkEnd w:id="32"/>
+    <w:bookmarkStart w:id="33" w:name="song-evaluation-2"/>
+    <w:p>
+      <w:pPr>
+        <w:pStyle w:val="Heading4"/>
+      </w:pPr>
+      <w:r>
+        <w:t xml:space="preserve">Song Evaluation</w:t>
+      </w:r>
+    </w:p>
+    <w:p>
+      <w:pPr>
+        <w:pStyle w:val="FirstParagraph"/>
       </w:pPr>
       <w:r>
         <w:rPr>
           <w:b/>
           <w:bCs/>
         </w:rPr>
-        <w:t xml:space="preserve">Strengths:</w:t>
+        <w:t xml:space="preserve">Song Strengths</w:t>
+      </w:r>
+      <w:r>
+        <w:t xml:space="preserve"> </w:t>
+      </w:r>
+      <w:r>
+        <w:rPr>
+          <w:i/>
+          <w:iCs/>
+        </w:rPr>
+        <w:t xml:space="preserve">(What sounds good? Cite specific musical moments):</w:t>
       </w:r>
     </w:p>
     <w:p>
@@ -7958,7 +8208,17 @@
           <w:b/>
           <w:bCs/>
         </w:rPr>
-        <w:t xml:space="preserve">Weaknesses:</w:t>
+        <w:t xml:space="preserve">Song Weaknesses</w:t>
+      </w:r>
+      <w:r>
+        <w:t xml:space="preserve"> </w:t>
+      </w:r>
+      <w:r>
+        <w:rPr>
+          <w:i/>
+          <w:iCs/>
+        </w:rPr>
+        <w:t xml:space="preserve">(What sounds wrong or weak? Cite specific musical problems):</w:t>
       </w:r>
     </w:p>
     <w:p>
@@ -7977,7 +8237,7 @@
           <w:b/>
           <w:bCs/>
         </w:rPr>
-        <w:t xml:space="preserve">What Improved from Round 2:</w:t>
+        <w:t xml:space="preserve">What improved in the song from Round 2:</w:t>
       </w:r>
     </w:p>
     <w:p>
@@ -7987,6 +8247,38 @@
         </w:pict>
       </w:r>
     </w:p>
+    <w:bookmarkEnd w:id="33"/>
+    <w:bookmarkStart w:id="34" w:name="prompt-evaluation-2"/>
+    <w:p>
+      <w:pPr>
+        <w:pStyle w:val="Heading4"/>
+      </w:pPr>
+      <w:r>
+        <w:t xml:space="preserve">Prompt Evaluation</w:t>
+      </w:r>
+    </w:p>
+    <w:p>
+      <w:pPr>
+        <w:pStyle w:val="FirstParagraph"/>
+      </w:pPr>
+      <w:r>
+        <w:rPr>
+          <w:b/>
+          <w:bCs/>
+        </w:rPr>
+        <w:t xml:space="preserve">What worked in the prompt</w:t>
+      </w:r>
+      <w:r>
+        <w:t xml:space="preserve"> </w:t>
+      </w:r>
+      <w:r>
+        <w:rPr>
+          <w:i/>
+          <w:iCs/>
+        </w:rPr>
+        <w:t xml:space="preserve">(Which keywords/phrases produced the results you wanted?):</w:t>
+      </w:r>
+    </w:p>
     <w:p>
       <w:r>
         <w:pict>
@@ -7994,9 +8286,45 @@
         </w:pict>
       </w:r>
     </w:p>
-    <w:bookmarkEnd w:id="28"/>
-    <w:bookmarkEnd w:id="29"/>
-    <w:bookmarkStart w:id="30" w:name="song-a-score-trajectory"/>
+    <w:p>
+      <w:pPr>
+        <w:pStyle w:val="FirstParagraph"/>
+      </w:pPr>
+      <w:r>
+        <w:rPr>
+          <w:b/>
+          <w:bCs/>
+        </w:rPr>
+        <w:t xml:space="preserve">What didn’t work in the prompt</w:t>
+      </w:r>
+      <w:r>
+        <w:t xml:space="preserve"> </w:t>
+      </w:r>
+      <w:r>
+        <w:rPr>
+          <w:i/>
+          <w:iCs/>
+        </w:rPr>
+        <w:t xml:space="preserve">(Which keywords/phrases were ignored, misinterpreted, or had no effect?):</w:t>
+      </w:r>
+    </w:p>
+    <w:p>
+      <w:r>
+        <w:pict>
+          <v:rect style="width:0;height:1.5pt" o:hralign="center" o:hrstd="t" o:hr="t"/>
+        </w:pict>
+      </w:r>
+    </w:p>
+    <w:p>
+      <w:r>
+        <w:pict>
+          <v:rect style="width:0;height:1.5pt" o:hralign="center" o:hrstd="t" o:hr="t"/>
+        </w:pict>
+      </w:r>
+    </w:p>
+    <w:bookmarkEnd w:id="34"/>
+    <w:bookmarkEnd w:id="35"/>
+    <w:bookmarkStart w:id="36" w:name="song-a-score-trajectory"/>
     <w:p>
       <w:pPr>
         <w:pStyle w:val="Heading3"/>
@@ -8345,9 +8673,9 @@
         </w:pict>
       </w:r>
     </w:p>
-    <w:bookmarkEnd w:id="30"/>
-    <w:bookmarkEnd w:id="31"/>
-    <w:bookmarkStart w:id="43" w:name="song-b-rounds-1-3"/>
+    <w:bookmarkEnd w:id="36"/>
+    <w:bookmarkEnd w:id="37"/>
+    <w:bookmarkStart w:id="55" w:name="song-b-rounds-1-3"/>
     <w:p>
       <w:pPr>
         <w:pStyle w:val="Heading2"/>
@@ -8356,7 +8684,7 @@
         <w:t xml:space="preserve">3. Song B: Rounds 1-3</w:t>
       </w:r>
     </w:p>
-    <w:bookmarkStart w:id="33" w:name="song-b-round-1-baseline"/>
+    <w:bookmarkStart w:id="41" w:name="song-b-round-1-baseline"/>
     <w:p>
       <w:pPr>
         <w:pStyle w:val="Heading3"/>
@@ -8419,7 +8747,7 @@
         <w:t xml:space="preserve">SongB_Round1.mp3</w:t>
       </w:r>
     </w:p>
-    <w:bookmarkStart w:id="32" w:name="harmonic-rubric-song-b-round-1"/>
+    <w:bookmarkStart w:id="38" w:name="harmonic-rubric-song-b-round-1"/>
     <w:p>
       <w:pPr>
         <w:pStyle w:val="Heading4"/>
@@ -10466,16 +10794,36 @@
         <w:t xml:space="preserve">Composite Score: _____ / 100</w:t>
       </w:r>
     </w:p>
-    <w:p>
-      <w:pPr>
-        <w:pStyle w:val="BodyText"/>
+    <w:bookmarkEnd w:id="38"/>
+    <w:bookmarkStart w:id="39" w:name="song-evaluation-3"/>
+    <w:p>
+      <w:pPr>
+        <w:pStyle w:val="Heading4"/>
+      </w:pPr>
+      <w:r>
+        <w:t xml:space="preserve">Song Evaluation</w:t>
+      </w:r>
+    </w:p>
+    <w:p>
+      <w:pPr>
+        <w:pStyle w:val="FirstParagraph"/>
       </w:pPr>
       <w:r>
         <w:rPr>
           <w:b/>
           <w:bCs/>
         </w:rPr>
-        <w:t xml:space="preserve">Strengths:</w:t>
+        <w:t xml:space="preserve">Song Strengths</w:t>
+      </w:r>
+      <w:r>
+        <w:t xml:space="preserve"> </w:t>
+      </w:r>
+      <w:r>
+        <w:rPr>
+          <w:i/>
+          <w:iCs/>
+        </w:rPr>
+        <w:t xml:space="preserve">(What sounds good? Cite specific musical moments — e.g., melody, rhythm, production, emotional impact, genre authenticity):</w:t>
       </w:r>
     </w:p>
     <w:p>
@@ -10494,7 +10842,17 @@
           <w:b/>
           <w:bCs/>
         </w:rPr>
-        <w:t xml:space="preserve">Weaknesses:</w:t>
+        <w:t xml:space="preserve">Song Weaknesses</w:t>
+      </w:r>
+      <w:r>
+        <w:t xml:space="preserve"> </w:t>
+      </w:r>
+      <w:r>
+        <w:rPr>
+          <w:i/>
+          <w:iCs/>
+        </w:rPr>
+        <w:t xml:space="preserve">(What sounds wrong or weak? Cite specific musical problems — e.g., artifacts, wrong instruments, weak structure, missing emotion):</w:t>
       </w:r>
     </w:p>
     <w:p>
@@ -10504,6 +10862,38 @@
         </w:pict>
       </w:r>
     </w:p>
+    <w:bookmarkEnd w:id="39"/>
+    <w:bookmarkStart w:id="40" w:name="prompt-evaluation-3"/>
+    <w:p>
+      <w:pPr>
+        <w:pStyle w:val="Heading4"/>
+      </w:pPr>
+      <w:r>
+        <w:t xml:space="preserve">Prompt Evaluation</w:t>
+      </w:r>
+    </w:p>
+    <w:p>
+      <w:pPr>
+        <w:pStyle w:val="FirstParagraph"/>
+      </w:pPr>
+      <w:r>
+        <w:rPr>
+          <w:b/>
+          <w:bCs/>
+        </w:rPr>
+        <w:t xml:space="preserve">What worked in the prompt</w:t>
+      </w:r>
+      <w:r>
+        <w:t xml:space="preserve"> </w:t>
+      </w:r>
+      <w:r>
+        <w:rPr>
+          <w:i/>
+          <w:iCs/>
+        </w:rPr>
+        <w:t xml:space="preserve">(Which keywords/phrases produced the results you wanted? What did the AI interpret correctly?):</w:t>
+      </w:r>
+    </w:p>
     <w:p>
       <w:r>
         <w:pict>
@@ -10511,26 +10901,6 @@
         </w:pict>
       </w:r>
     </w:p>
-    <w:bookmarkEnd w:id="32"/>
-    <w:bookmarkEnd w:id="33"/>
-    <w:bookmarkStart w:id="37" w:name="song-b-round-2-targeted-refinement"/>
-    <w:p>
-      <w:pPr>
-        <w:pStyle w:val="Heading3"/>
-      </w:pPr>
-      <w:r>
-        <w:t xml:space="preserve">Song B — Round 2 (Targeted Refinement)</w:t>
-      </w:r>
-    </w:p>
-    <w:bookmarkStart w:id="34" w:name="reflection-on-round-1-1"/>
-    <w:p>
-      <w:pPr>
-        <w:pStyle w:val="Heading4"/>
-      </w:pPr>
-      <w:r>
-        <w:t xml:space="preserve">Reflection on Round 1</w:t>
-      </w:r>
-    </w:p>
     <w:p>
       <w:pPr>
         <w:pStyle w:val="FirstParagraph"/>
@@ -10540,7 +10910,7 @@
           <w:b/>
           <w:bCs/>
         </w:rPr>
-        <w:t xml:space="preserve">Strengths from Round 1</w:t>
+        <w:t xml:space="preserve">What didn’t work in the prompt</w:t>
       </w:r>
       <w:r>
         <w:t xml:space="preserve"> </w:t>
@@ -10550,7 +10920,7 @@
           <w:i/>
           <w:iCs/>
         </w:rPr>
-        <w:t xml:space="preserve">(What worked well? Which rubric categories scored highest and why?):</w:t>
+        <w:t xml:space="preserve">(Which keywords/phrases were ignored, misinterpreted, or had no effect? What was missing?):</w:t>
       </w:r>
     </w:p>
     <w:p>
@@ -10561,42 +10931,30 @@
       </w:r>
     </w:p>
     <w:p>
-      <w:pPr>
-        <w:pStyle w:val="FirstParagraph"/>
-      </w:pPr>
-      <w:r>
-        <w:rPr>
-          <w:b/>
-          <w:bCs/>
-        </w:rPr>
-        <w:t xml:space="preserve">Weaknesses from Round 1</w:t>
-      </w:r>
-      <w:r>
-        <w:t xml:space="preserve"> </w:t>
-      </w:r>
-      <w:r>
-        <w:rPr>
-          <w:i/>
-          <w:iCs/>
-        </w:rPr>
-        <w:t xml:space="preserve">(What fell short? Which rubric categories scored lowest and why?):</w:t>
-      </w:r>
-    </w:p>
-    <w:p>
       <w:r>
         <w:pict>
           <v:rect style="width:0;height:1.5pt" o:hralign="center" o:hrstd="t" o:hr="t"/>
         </w:pict>
       </w:r>
     </w:p>
-    <w:bookmarkEnd w:id="34"/>
-    <w:bookmarkStart w:id="35" w:name="prompt-revision-reasoning-2"/>
+    <w:bookmarkEnd w:id="40"/>
+    <w:bookmarkEnd w:id="41"/>
+    <w:bookmarkStart w:id="47" w:name="song-b-round-2-targeted-refinement"/>
+    <w:p>
+      <w:pPr>
+        <w:pStyle w:val="Heading3"/>
+      </w:pPr>
+      <w:r>
+        <w:t xml:space="preserve">Song B — Round 2 (Targeted Refinement)</w:t>
+      </w:r>
+    </w:p>
+    <w:bookmarkStart w:id="42" w:name="reflection-on-round-1-1"/>
     <w:p>
       <w:pPr>
         <w:pStyle w:val="Heading4"/>
       </w:pPr>
       <w:r>
-        <w:t xml:space="preserve">Prompt Revision Reasoning</w:t>
+        <w:t xml:space="preserve">Reflection on Round 1</w:t>
       </w:r>
     </w:p>
     <w:p>
@@ -10608,7 +10966,75 @@
           <w:b/>
           <w:bCs/>
         </w:rPr>
-        <w:t xml:space="preserve">Specific prompt elements you changed, added, or deleted:</w:t>
+        <w:t xml:space="preserve">Song issues to fix</w:t>
+      </w:r>
+      <w:r>
+        <w:t xml:space="preserve"> </w:t>
+      </w:r>
+      <w:r>
+        <w:rPr>
+          <w:i/>
+          <w:iCs/>
+        </w:rPr>
+        <w:t xml:space="preserve">(Based on your Round 1 rubric scores, which 2-3 musical weaknesses are you targeting?):</w:t>
+      </w:r>
+    </w:p>
+    <w:p>
+      <w:r>
+        <w:pict>
+          <v:rect style="width:0;height:1.5pt" o:hralign="center" o:hrstd="t" o:hr="t"/>
+        </w:pict>
+      </w:r>
+    </w:p>
+    <w:p>
+      <w:pPr>
+        <w:pStyle w:val="FirstParagraph"/>
+      </w:pPr>
+      <w:r>
+        <w:rPr>
+          <w:b/>
+          <w:bCs/>
+        </w:rPr>
+        <w:t xml:space="preserve">Prompt issues to fix</w:t>
+      </w:r>
+      <w:r>
+        <w:t xml:space="preserve"> </w:t>
+      </w:r>
+      <w:r>
+        <w:rPr>
+          <w:i/>
+          <w:iCs/>
+        </w:rPr>
+        <w:t xml:space="preserve">(Based on your Round 1 prompt evaluation, which words/phrases failed and need to be reworked?):</w:t>
+      </w:r>
+    </w:p>
+    <w:p>
+      <w:r>
+        <w:pict>
+          <v:rect style="width:0;height:1.5pt" o:hralign="center" o:hrstd="t" o:hr="t"/>
+        </w:pict>
+      </w:r>
+    </w:p>
+    <w:bookmarkEnd w:id="42"/>
+    <w:bookmarkStart w:id="43" w:name="prompt-revision-reasoning-2"/>
+    <w:p>
+      <w:pPr>
+        <w:pStyle w:val="Heading4"/>
+      </w:pPr>
+      <w:r>
+        <w:t xml:space="preserve">Prompt Revision Reasoning</w:t>
+      </w:r>
+    </w:p>
+    <w:p>
+      <w:pPr>
+        <w:pStyle w:val="FirstParagraph"/>
+      </w:pPr>
+      <w:r>
+        <w:rPr>
+          <w:b/>
+          <w:bCs/>
+        </w:rPr>
+        <w:t xml:space="preserve">Specific prompt elements you changed, added, or deleted to address the above:</w:t>
       </w:r>
     </w:p>
     <w:tbl>
@@ -10619,9 +11045,10 @@
         <w:tblLook w:firstRow="1" w:lastRow="0" w:firstColumn="0" w:lastColumn="0" w:noHBand="0" w:noVBand="0" w:val="0020"/>
       </w:tblPr>
       <w:tblGrid>
-        <w:gridCol w:w="1240"/>
-        <w:gridCol w:w="2958"/>
-        <w:gridCol w:w="3721"/>
+        <w:gridCol w:w="1040"/>
+        <w:gridCol w:w="3040"/>
+        <w:gridCol w:w="2960"/>
+        <w:gridCol w:w="880"/>
       </w:tblGrid>
       <w:tr>
         <w:trPr>
@@ -10646,18 +11073,29 @@
               <w:pStyle w:val="Compact"/>
             </w:pPr>
             <w:r>
-              <w:t xml:space="preserve">What You Changed in the Prompt</w:t>
-            </w:r>
-          </w:p>
-        </w:tc>
-        <w:tc>
-          <w:tcPr/>
-          <w:p>
-            <w:pPr>
-              <w:pStyle w:val="Compact"/>
-            </w:pPr>
-            <w:r>
-              <w:t xml:space="preserve">Which Strength/Weakness This Addresses</w:t>
+              <w:t xml:space="preserve">Exact Words/Phrases Changed in Prompt</w:t>
+            </w:r>
+          </w:p>
+        </w:tc>
+        <w:tc>
+          <w:tcPr/>
+          <w:p>
+            <w:pPr>
+              <w:pStyle w:val="Compact"/>
+            </w:pPr>
+            <w:r>
+              <w:t xml:space="preserve">Song or Prompt Issue This Addresses</w:t>
+            </w:r>
+          </w:p>
+        </w:tc>
+        <w:tc>
+          <w:tcPr/>
+          <w:p>
+            <w:pPr>
+              <w:pStyle w:val="Compact"/>
+            </w:pPr>
+            <w:r>
+              <w:t xml:space="preserve">Reasoning</w:t>
             </w:r>
           </w:p>
         </w:tc>
@@ -10691,6 +11129,14 @@
             </w:pPr>
           </w:p>
         </w:tc>
+        <w:tc>
+          <w:tcPr/>
+          <w:p>
+            <w:pPr>
+              <w:pStyle w:val="Compact"/>
+            </w:pPr>
+          </w:p>
+        </w:tc>
       </w:tr>
       <w:tr>
         <w:tc>
@@ -10721,6 +11167,14 @@
             </w:pPr>
           </w:p>
         </w:tc>
+        <w:tc>
+          <w:tcPr/>
+          <w:p>
+            <w:pPr>
+              <w:pStyle w:val="Compact"/>
+            </w:pPr>
+          </w:p>
+        </w:tc>
       </w:tr>
       <w:tr>
         <w:tc>
@@ -10733,6 +11187,14 @@
             <w:r>
               <w:t xml:space="preserve">Deleted</w:t>
             </w:r>
+          </w:p>
+        </w:tc>
+        <w:tc>
+          <w:tcPr/>
+          <w:p>
+            <w:pPr>
+              <w:pStyle w:val="Compact"/>
+            </w:pPr>
           </w:p>
         </w:tc>
         <w:tc>
@@ -10762,14 +11224,28 @@
           <w:b/>
           <w:bCs/>
         </w:rPr>
-        <w:t xml:space="preserve">Why you believe these changes will improve the output:</w:t>
-      </w:r>
-    </w:p>
-    <w:p>
-      <w:r>
-        <w:pict>
-          <v:rect style="width:0;height:1.5pt" o:hralign="center" o:hrstd="t" o:hr="t"/>
-        </w:pict>
+        <w:t xml:space="preserve">Prompt Used</w:t>
+      </w:r>
+      <w:r>
+        <w:t xml:space="preserve"> </w:t>
+      </w:r>
+      <w:r>
+        <w:rPr>
+          <w:i/>
+          <w:iCs/>
+        </w:rPr>
+        <w:t xml:space="preserve">(verbatim):</w:t>
+      </w:r>
+    </w:p>
+    <w:p>
+      <w:pPr>
+        <w:pStyle w:val="SourceCode"/>
+      </w:pPr>
+      <w:r>
+        <w:rPr>
+          <w:rStyle w:val="VerbatimChar"/>
+        </w:rPr>
+        <w:t xml:space="preserve">[paste your exact prompt here]</w:t>
       </w:r>
     </w:p>
     <w:p>
@@ -10781,7 +11257,7 @@
           <w:b/>
           <w:bCs/>
         </w:rPr>
-        <w:t xml:space="preserve">Prompt Used</w:t>
+        <w:t xml:space="preserve">Refinement Strategy Used</w:t>
       </w:r>
       <w:r>
         <w:t xml:space="preserve"> </w:t>
@@ -10791,113 +11267,80 @@
           <w:i/>
           <w:iCs/>
         </w:rPr>
-        <w:t xml:space="preserve">(verbatim):</w:t>
-      </w:r>
-    </w:p>
-    <w:p>
-      <w:pPr>
-        <w:pStyle w:val="SourceCode"/>
-      </w:pPr>
-      <w:r>
-        <w:rPr>
-          <w:rStyle w:val="VerbatimChar"/>
-        </w:rPr>
-        <w:t xml:space="preserve">[paste your exact prompt here]</w:t>
-      </w:r>
-    </w:p>
-    <w:p>
-      <w:pPr>
-        <w:pStyle w:val="FirstParagraph"/>
+        <w:t xml:space="preserve">(check all that apply):</w:t>
+      </w:r>
+      <w:r>
+        <w:t xml:space="preserve"> </w:t>
+      </w:r>
+      <w:r>
+        <w:t xml:space="preserve">- [ ] Technical specificity</w:t>
+      </w:r>
+      <w:r>
+        <w:t xml:space="preserve"> </w:t>
+      </w:r>
+      <w:r>
+        <w:t xml:space="preserve">- [ ] Reference enhancement</w:t>
+      </w:r>
+      <w:r>
+        <w:t xml:space="preserve"> </w:t>
+      </w:r>
+      <w:r>
+        <w:t xml:space="preserve">- [ ] Emotional elaboration</w:t>
+      </w:r>
+      <w:r>
+        <w:t xml:space="preserve"> </w:t>
+      </w:r>
+      <w:r>
+        <w:t xml:space="preserve">- [ ] Constraint adjustment</w:t>
+      </w:r>
+      <w:r>
+        <w:t xml:space="preserve"> </w:t>
+      </w:r>
+      <w:r>
+        <w:t xml:space="preserve">- [ ] Cultural contextualization</w:t>
+      </w:r>
+      <w:r>
+        <w:t xml:space="preserve"> </w:t>
+      </w:r>
+      <w:r>
+        <w:t xml:space="preserve">- [ ] Feedback incorporation</w:t>
+      </w:r>
+      <w:r>
+        <w:t xml:space="preserve"> </w:t>
+      </w:r>
+      <w:r>
+        <w:t xml:space="preserve">- [ ] Prompt restructuring</w:t>
+      </w:r>
+      <w:r>
+        <w:t xml:space="preserve"> </w:t>
+      </w:r>
+      <w:r>
+        <w:t xml:space="preserve">- [ ] Length modification</w:t>
+      </w:r>
+    </w:p>
+    <w:p>
+      <w:pPr>
+        <w:pStyle w:val="BodyText"/>
       </w:pPr>
       <w:r>
         <w:rPr>
           <w:b/>
           <w:bCs/>
         </w:rPr>
-        <w:t xml:space="preserve">Refinement Strategy Used</w:t>
+        <w:t xml:space="preserve">Audio File:</w:t>
       </w:r>
       <w:r>
         <w:t xml:space="preserve"> </w:t>
       </w:r>
       <w:r>
         <w:rPr>
-          <w:i/>
-          <w:iCs/>
-        </w:rPr>
-        <w:t xml:space="preserve">(check all that apply):</w:t>
-      </w:r>
-      <w:r>
-        <w:t xml:space="preserve"> </w:t>
-      </w:r>
-      <w:r>
-        <w:t xml:space="preserve">- [ ] Technical specificity</w:t>
-      </w:r>
-      <w:r>
-        <w:t xml:space="preserve"> </w:t>
-      </w:r>
-      <w:r>
-        <w:t xml:space="preserve">- [ ] Reference enhancement</w:t>
-      </w:r>
-      <w:r>
-        <w:t xml:space="preserve"> </w:t>
-      </w:r>
-      <w:r>
-        <w:t xml:space="preserve">- [ ] Emotional elaboration</w:t>
-      </w:r>
-      <w:r>
-        <w:t xml:space="preserve"> </w:t>
-      </w:r>
-      <w:r>
-        <w:t xml:space="preserve">- [ ] Constraint adjustment</w:t>
-      </w:r>
-      <w:r>
-        <w:t xml:space="preserve"> </w:t>
-      </w:r>
-      <w:r>
-        <w:t xml:space="preserve">- [ ] Cultural contextualization</w:t>
-      </w:r>
-      <w:r>
-        <w:t xml:space="preserve"> </w:t>
-      </w:r>
-      <w:r>
-        <w:t xml:space="preserve">- [ ] Feedback incorporation</w:t>
-      </w:r>
-      <w:r>
-        <w:t xml:space="preserve"> </w:t>
-      </w:r>
-      <w:r>
-        <w:t xml:space="preserve">- [ ] Prompt restructuring</w:t>
-      </w:r>
-      <w:r>
-        <w:t xml:space="preserve"> </w:t>
-      </w:r>
-      <w:r>
-        <w:t xml:space="preserve">- [ ] Length modification</w:t>
-      </w:r>
-    </w:p>
-    <w:p>
-      <w:pPr>
-        <w:pStyle w:val="BodyText"/>
-      </w:pPr>
-      <w:r>
-        <w:rPr>
-          <w:b/>
-          <w:bCs/>
-        </w:rPr>
-        <w:t xml:space="preserve">Audio File:</w:t>
-      </w:r>
-      <w:r>
-        <w:t xml:space="preserve"> </w:t>
-      </w:r>
-      <w:r>
-        <w:rPr>
           <w:rStyle w:val="VerbatimChar"/>
         </w:rPr>
         <w:t xml:space="preserve">SongB_Round2.mp3</w:t>
       </w:r>
     </w:p>
-    <w:bookmarkEnd w:id="35"/>
-    <w:bookmarkStart w:id="36" w:name="harmonic-rubric-song-b-round-2"/>
+    <w:bookmarkEnd w:id="43"/>
+    <w:bookmarkStart w:id="44" w:name="harmonic-rubric-song-b-round-2"/>
     <w:p>
       <w:pPr>
         <w:pStyle w:val="Heading4"/>
@@ -12944,16 +13387,36 @@
         <w:t xml:space="preserve">Composite Score: _____ / 100</w:t>
       </w:r>
     </w:p>
-    <w:p>
-      <w:pPr>
-        <w:pStyle w:val="BodyText"/>
+    <w:bookmarkEnd w:id="44"/>
+    <w:bookmarkStart w:id="45" w:name="song-evaluation-4"/>
+    <w:p>
+      <w:pPr>
+        <w:pStyle w:val="Heading4"/>
+      </w:pPr>
+      <w:r>
+        <w:t xml:space="preserve">Song Evaluation</w:t>
+      </w:r>
+    </w:p>
+    <w:p>
+      <w:pPr>
+        <w:pStyle w:val="FirstParagraph"/>
       </w:pPr>
       <w:r>
         <w:rPr>
           <w:b/>
           <w:bCs/>
         </w:rPr>
-        <w:t xml:space="preserve">Strengths:</w:t>
+        <w:t xml:space="preserve">Song Strengths</w:t>
+      </w:r>
+      <w:r>
+        <w:t xml:space="preserve"> </w:t>
+      </w:r>
+      <w:r>
+        <w:rPr>
+          <w:i/>
+          <w:iCs/>
+        </w:rPr>
+        <w:t xml:space="preserve">(What sounds good? Cite specific musical moments — e.g., melody, rhythm, production, emotional impact, genre authenticity):</w:t>
       </w:r>
     </w:p>
     <w:p>
@@ -12972,7 +13435,17 @@
           <w:b/>
           <w:bCs/>
         </w:rPr>
-        <w:t xml:space="preserve">Weaknesses:</w:t>
+        <w:t xml:space="preserve">Song Weaknesses</w:t>
+      </w:r>
+      <w:r>
+        <w:t xml:space="preserve"> </w:t>
+      </w:r>
+      <w:r>
+        <w:rPr>
+          <w:i/>
+          <w:iCs/>
+        </w:rPr>
+        <w:t xml:space="preserve">(What sounds wrong or weak? Cite specific musical problems — e.g., artifacts, wrong instruments, weak structure, missing emotion):</w:t>
       </w:r>
     </w:p>
     <w:p>
@@ -12991,7 +13464,7 @@
           <w:b/>
           <w:bCs/>
         </w:rPr>
-        <w:t xml:space="preserve">What Improved from Round 1:</w:t>
+        <w:t xml:space="preserve">What improved in the song from Round 1:</w:t>
       </w:r>
     </w:p>
     <w:p>
@@ -13001,6 +13474,38 @@
         </w:pict>
       </w:r>
     </w:p>
+    <w:bookmarkEnd w:id="45"/>
+    <w:bookmarkStart w:id="46" w:name="prompt-evaluation-4"/>
+    <w:p>
+      <w:pPr>
+        <w:pStyle w:val="Heading4"/>
+      </w:pPr>
+      <w:r>
+        <w:t xml:space="preserve">Prompt Evaluation</w:t>
+      </w:r>
+    </w:p>
+    <w:p>
+      <w:pPr>
+        <w:pStyle w:val="FirstParagraph"/>
+      </w:pPr>
+      <w:r>
+        <w:rPr>
+          <w:b/>
+          <w:bCs/>
+        </w:rPr>
+        <w:t xml:space="preserve">What worked in the prompt</w:t>
+      </w:r>
+      <w:r>
+        <w:t xml:space="preserve"> </w:t>
+      </w:r>
+      <w:r>
+        <w:rPr>
+          <w:i/>
+          <w:iCs/>
+        </w:rPr>
+        <w:t xml:space="preserve">(Which keywords/phrases produced the results you wanted? What did the AI interpret correctly?):</w:t>
+      </w:r>
+    </w:p>
     <w:p>
       <w:r>
         <w:pict>
@@ -13008,26 +13513,6 @@
         </w:pict>
       </w:r>
     </w:p>
-    <w:bookmarkEnd w:id="36"/>
-    <w:bookmarkEnd w:id="37"/>
-    <w:bookmarkStart w:id="41" w:name="song-b-round-3-fine-tuning"/>
-    <w:p>
-      <w:pPr>
-        <w:pStyle w:val="Heading3"/>
-      </w:pPr>
-      <w:r>
-        <w:t xml:space="preserve">Song B — Round 3 (Fine-Tuning)</w:t>
-      </w:r>
-    </w:p>
-    <w:bookmarkStart w:id="38" w:name="reflection-on-rounds-1-and-2-1"/>
-    <w:p>
-      <w:pPr>
-        <w:pStyle w:val="Heading4"/>
-      </w:pPr>
-      <w:r>
-        <w:t xml:space="preserve">Reflection on Rounds 1 and 2</w:t>
-      </w:r>
-    </w:p>
     <w:p>
       <w:pPr>
         <w:pStyle w:val="FirstParagraph"/>
@@ -13037,7 +13522,7 @@
           <w:b/>
           <w:bCs/>
         </w:rPr>
-        <w:t xml:space="preserve">Strengths from Round 2</w:t>
+        <w:t xml:space="preserve">What didn’t work in the prompt</w:t>
       </w:r>
       <w:r>
         <w:t xml:space="preserve"> </w:t>
@@ -13047,7 +13532,7 @@
           <w:i/>
           <w:iCs/>
         </w:rPr>
-        <w:t xml:space="preserve">(What improved from Round 1? What new strengths emerged?):</w:t>
+        <w:t xml:space="preserve">(Which keywords/phrases were ignored, misinterpreted, or had no effect? What was missing?):</w:t>
       </w:r>
     </w:p>
     <w:p>
@@ -13058,34 +13543,32 @@
       </w:r>
     </w:p>
     <w:p>
-      <w:pPr>
-        <w:pStyle w:val="FirstParagraph"/>
-      </w:pPr>
-      <w:r>
-        <w:rPr>
-          <w:b/>
-          <w:bCs/>
-        </w:rPr>
-        <w:t xml:space="preserve">Remaining weaknesses</w:t>
-      </w:r>
-      <w:r>
-        <w:t xml:space="preserve"> </w:t>
-      </w:r>
-      <w:r>
-        <w:rPr>
-          <w:i/>
-          <w:iCs/>
-        </w:rPr>
-        <w:t xml:space="preserve">(What issues persisted or appeared despite Round 2 refinements?):</w:t>
-      </w:r>
-    </w:p>
-    <w:p>
       <w:r>
         <w:pict>
           <v:rect style="width:0;height:1.5pt" o:hralign="center" o:hrstd="t" o:hr="t"/>
         </w:pict>
       </w:r>
     </w:p>
+    <w:bookmarkEnd w:id="46"/>
+    <w:bookmarkEnd w:id="47"/>
+    <w:bookmarkStart w:id="53" w:name="song-b-round-3-fine-tuning"/>
+    <w:p>
+      <w:pPr>
+        <w:pStyle w:val="Heading3"/>
+      </w:pPr>
+      <w:r>
+        <w:t xml:space="preserve">Song B — Round 3 (Fine-Tuning)</w:t>
+      </w:r>
+    </w:p>
+    <w:bookmarkStart w:id="48" w:name="reflection-on-rounds-1-and-2-1"/>
+    <w:p>
+      <w:pPr>
+        <w:pStyle w:val="Heading4"/>
+      </w:pPr>
+      <w:r>
+        <w:t xml:space="preserve">Reflection on Rounds 1 and 2</w:t>
+      </w:r>
+    </w:p>
     <w:p>
       <w:pPr>
         <w:pStyle w:val="FirstParagraph"/>
@@ -13095,7 +13578,7 @@
           <w:b/>
           <w:bCs/>
         </w:rPr>
-        <w:t xml:space="preserve">Assessment of Round 2 refinement strategy</w:t>
+        <w:t xml:space="preserve">Song issues to fix</w:t>
       </w:r>
       <w:r>
         <w:t xml:space="preserve"> </w:t>
@@ -13105,7 +13588,7 @@
           <w:i/>
           <w:iCs/>
         </w:rPr>
-        <w:t xml:space="preserve">(Was your targeted refinement effective? Did addressing the weaknesses you identified actually improve those rubric scores?):</w:t>
+        <w:t xml:space="preserve">(Based on your Round 2 rubric scores, which musical weaknesses remain or emerged? Did Round 2 fixes actually improve those scores?):</w:t>
       </w:r>
     </w:p>
     <w:p>
@@ -13115,16 +13598,6 @@
         </w:pict>
       </w:r>
     </w:p>
-    <w:bookmarkEnd w:id="38"/>
-    <w:bookmarkStart w:id="39" w:name="prompt-revision-reasoning-3"/>
-    <w:p>
-      <w:pPr>
-        <w:pStyle w:val="Heading4"/>
-      </w:pPr>
-      <w:r>
-        <w:t xml:space="preserve">Prompt Revision Reasoning</w:t>
-      </w:r>
-    </w:p>
     <w:p>
       <w:pPr>
         <w:pStyle w:val="FirstParagraph"/>
@@ -13134,7 +13607,75 @@
           <w:b/>
           <w:bCs/>
         </w:rPr>
-        <w:t xml:space="preserve">Specific prompt elements you changed, added, or deleted:</w:t>
+        <w:t xml:space="preserve">Prompt issues to fix</w:t>
+      </w:r>
+      <w:r>
+        <w:t xml:space="preserve"> </w:t>
+      </w:r>
+      <w:r>
+        <w:rPr>
+          <w:i/>
+          <w:iCs/>
+        </w:rPr>
+        <w:t xml:space="preserve">(Which prompt words/phrases still aren’t working? What was misinterpreted or ignored in Round 2?):</w:t>
+      </w:r>
+    </w:p>
+    <w:p>
+      <w:r>
+        <w:pict>
+          <v:rect style="width:0;height:1.5pt" o:hralign="center" o:hrstd="t" o:hr="t"/>
+        </w:pict>
+      </w:r>
+    </w:p>
+    <w:p>
+      <w:pPr>
+        <w:pStyle w:val="FirstParagraph"/>
+      </w:pPr>
+      <w:r>
+        <w:rPr>
+          <w:b/>
+          <w:bCs/>
+        </w:rPr>
+        <w:t xml:space="preserve">Assessment of Round 2 refinement strategy</w:t>
+      </w:r>
+      <w:r>
+        <w:t xml:space="preserve"> </w:t>
+      </w:r>
+      <w:r>
+        <w:rPr>
+          <w:i/>
+          <w:iCs/>
+        </w:rPr>
+        <w:t xml:space="preserve">(Was your targeted refinement effective? Which prompt changes worked and which didn’t?):</w:t>
+      </w:r>
+    </w:p>
+    <w:p>
+      <w:r>
+        <w:pict>
+          <v:rect style="width:0;height:1.5pt" o:hralign="center" o:hrstd="t" o:hr="t"/>
+        </w:pict>
+      </w:r>
+    </w:p>
+    <w:bookmarkEnd w:id="48"/>
+    <w:bookmarkStart w:id="49" w:name="prompt-revision-reasoning-3"/>
+    <w:p>
+      <w:pPr>
+        <w:pStyle w:val="Heading4"/>
+      </w:pPr>
+      <w:r>
+        <w:t xml:space="preserve">Prompt Revision Reasoning</w:t>
+      </w:r>
+    </w:p>
+    <w:p>
+      <w:pPr>
+        <w:pStyle w:val="FirstParagraph"/>
+      </w:pPr>
+      <w:r>
+        <w:rPr>
+          <w:b/>
+          <w:bCs/>
+        </w:rPr>
+        <w:t xml:space="preserve">Specific prompt elements you changed, added, or deleted to address the above:</w:t>
       </w:r>
     </w:p>
     <w:tbl>
@@ -13145,9 +13686,10 @@
         <w:tblLook w:firstRow="1" w:lastRow="0" w:firstColumn="0" w:lastColumn="0" w:noHBand="0" w:noVBand="0" w:val="0020"/>
       </w:tblPr>
       <w:tblGrid>
-        <w:gridCol w:w="1240"/>
-        <w:gridCol w:w="2958"/>
-        <w:gridCol w:w="3721"/>
+        <w:gridCol w:w="1040"/>
+        <w:gridCol w:w="3040"/>
+        <w:gridCol w:w="2960"/>
+        <w:gridCol w:w="880"/>
       </w:tblGrid>
       <w:tr>
         <w:trPr>
@@ -13172,18 +13714,29 @@
               <w:pStyle w:val="Compact"/>
             </w:pPr>
             <w:r>
-              <w:t xml:space="preserve">What You Changed in the Prompt</w:t>
-            </w:r>
-          </w:p>
-        </w:tc>
-        <w:tc>
-          <w:tcPr/>
-          <w:p>
-            <w:pPr>
-              <w:pStyle w:val="Compact"/>
-            </w:pPr>
-            <w:r>
-              <w:t xml:space="preserve">Which Strength/Weakness This Addresses</w:t>
+              <w:t xml:space="preserve">Exact Words/Phrases Changed in Prompt</w:t>
+            </w:r>
+          </w:p>
+        </w:tc>
+        <w:tc>
+          <w:tcPr/>
+          <w:p>
+            <w:pPr>
+              <w:pStyle w:val="Compact"/>
+            </w:pPr>
+            <w:r>
+              <w:t xml:space="preserve">Song or Prompt Issue This Addresses</w:t>
+            </w:r>
+          </w:p>
+        </w:tc>
+        <w:tc>
+          <w:tcPr/>
+          <w:p>
+            <w:pPr>
+              <w:pStyle w:val="Compact"/>
+            </w:pPr>
+            <w:r>
+              <w:t xml:space="preserve">Reasoning</w:t>
             </w:r>
           </w:p>
         </w:tc>
@@ -13217,6 +13770,14 @@
             </w:pPr>
           </w:p>
         </w:tc>
+        <w:tc>
+          <w:tcPr/>
+          <w:p>
+            <w:pPr>
+              <w:pStyle w:val="Compact"/>
+            </w:pPr>
+          </w:p>
+        </w:tc>
       </w:tr>
       <w:tr>
         <w:tc>
@@ -13247,6 +13808,14 @@
             </w:pPr>
           </w:p>
         </w:tc>
+        <w:tc>
+          <w:tcPr/>
+          <w:p>
+            <w:pPr>
+              <w:pStyle w:val="Compact"/>
+            </w:pPr>
+          </w:p>
+        </w:tc>
       </w:tr>
       <w:tr>
         <w:tc>
@@ -13259,6 +13828,14 @@
             <w:r>
               <w:t xml:space="preserve">Deleted</w:t>
             </w:r>
+          </w:p>
+        </w:tc>
+        <w:tc>
+          <w:tcPr/>
+          <w:p>
+            <w:pPr>
+              <w:pStyle w:val="Compact"/>
+            </w:pPr>
           </w:p>
         </w:tc>
         <w:tc>
@@ -13288,14 +13865,28 @@
           <w:b/>
           <w:bCs/>
         </w:rPr>
-        <w:t xml:space="preserve">Why you believe these changes will improve the output:</w:t>
-      </w:r>
-    </w:p>
-    <w:p>
-      <w:r>
-        <w:pict>
-          <v:rect style="width:0;height:1.5pt" o:hralign="center" o:hrstd="t" o:hr="t"/>
-        </w:pict>
+        <w:t xml:space="preserve">Prompt Used</w:t>
+      </w:r>
+      <w:r>
+        <w:t xml:space="preserve"> </w:t>
+      </w:r>
+      <w:r>
+        <w:rPr>
+          <w:i/>
+          <w:iCs/>
+        </w:rPr>
+        <w:t xml:space="preserve">(verbatim):</w:t>
+      </w:r>
+    </w:p>
+    <w:p>
+      <w:pPr>
+        <w:pStyle w:val="SourceCode"/>
+      </w:pPr>
+      <w:r>
+        <w:rPr>
+          <w:rStyle w:val="VerbatimChar"/>
+        </w:rPr>
+        <w:t xml:space="preserve">[paste your exact prompt here]</w:t>
       </w:r>
     </w:p>
     <w:p>
@@ -13307,7 +13898,7 @@
           <w:b/>
           <w:bCs/>
         </w:rPr>
-        <w:t xml:space="preserve">Prompt Used</w:t>
+        <w:t xml:space="preserve">Refinement Strategy Used</w:t>
       </w:r>
       <w:r>
         <w:t xml:space="preserve"> </w:t>
@@ -13317,113 +13908,80 @@
           <w:i/>
           <w:iCs/>
         </w:rPr>
-        <w:t xml:space="preserve">(verbatim):</w:t>
-      </w:r>
-    </w:p>
-    <w:p>
-      <w:pPr>
-        <w:pStyle w:val="SourceCode"/>
-      </w:pPr>
-      <w:r>
-        <w:rPr>
-          <w:rStyle w:val="VerbatimChar"/>
-        </w:rPr>
-        <w:t xml:space="preserve">[paste your exact prompt here]</w:t>
-      </w:r>
-    </w:p>
-    <w:p>
-      <w:pPr>
-        <w:pStyle w:val="FirstParagraph"/>
+        <w:t xml:space="preserve">(check all that apply):</w:t>
+      </w:r>
+      <w:r>
+        <w:t xml:space="preserve"> </w:t>
+      </w:r>
+      <w:r>
+        <w:t xml:space="preserve">- [ ] Technical specificity</w:t>
+      </w:r>
+      <w:r>
+        <w:t xml:space="preserve"> </w:t>
+      </w:r>
+      <w:r>
+        <w:t xml:space="preserve">- [ ] Reference enhancement</w:t>
+      </w:r>
+      <w:r>
+        <w:t xml:space="preserve"> </w:t>
+      </w:r>
+      <w:r>
+        <w:t xml:space="preserve">- [ ] Emotional elaboration</w:t>
+      </w:r>
+      <w:r>
+        <w:t xml:space="preserve"> </w:t>
+      </w:r>
+      <w:r>
+        <w:t xml:space="preserve">- [ ] Constraint adjustment</w:t>
+      </w:r>
+      <w:r>
+        <w:t xml:space="preserve"> </w:t>
+      </w:r>
+      <w:r>
+        <w:t xml:space="preserve">- [ ] Cultural contextualization</w:t>
+      </w:r>
+      <w:r>
+        <w:t xml:space="preserve"> </w:t>
+      </w:r>
+      <w:r>
+        <w:t xml:space="preserve">- [ ] Feedback incorporation</w:t>
+      </w:r>
+      <w:r>
+        <w:t xml:space="preserve"> </w:t>
+      </w:r>
+      <w:r>
+        <w:t xml:space="preserve">- [ ] Prompt restructuring</w:t>
+      </w:r>
+      <w:r>
+        <w:t xml:space="preserve"> </w:t>
+      </w:r>
+      <w:r>
+        <w:t xml:space="preserve">- [ ] Length modification</w:t>
+      </w:r>
+    </w:p>
+    <w:p>
+      <w:pPr>
+        <w:pStyle w:val="BodyText"/>
       </w:pPr>
       <w:r>
         <w:rPr>
           <w:b/>
           <w:bCs/>
         </w:rPr>
-        <w:t xml:space="preserve">Refinement Strategy Used</w:t>
+        <w:t xml:space="preserve">Audio File:</w:t>
       </w:r>
       <w:r>
         <w:t xml:space="preserve"> </w:t>
       </w:r>
       <w:r>
         <w:rPr>
-          <w:i/>
-          <w:iCs/>
-        </w:rPr>
-        <w:t xml:space="preserve">(check all that apply):</w:t>
-      </w:r>
-      <w:r>
-        <w:t xml:space="preserve"> </w:t>
-      </w:r>
-      <w:r>
-        <w:t xml:space="preserve">- [ ] Technical specificity</w:t>
-      </w:r>
-      <w:r>
-        <w:t xml:space="preserve"> </w:t>
-      </w:r>
-      <w:r>
-        <w:t xml:space="preserve">- [ ] Reference enhancement</w:t>
-      </w:r>
-      <w:r>
-        <w:t xml:space="preserve"> </w:t>
-      </w:r>
-      <w:r>
-        <w:t xml:space="preserve">- [ ] Emotional elaboration</w:t>
-      </w:r>
-      <w:r>
-        <w:t xml:space="preserve"> </w:t>
-      </w:r>
-      <w:r>
-        <w:t xml:space="preserve">- [ ] Constraint adjustment</w:t>
-      </w:r>
-      <w:r>
-        <w:t xml:space="preserve"> </w:t>
-      </w:r>
-      <w:r>
-        <w:t xml:space="preserve">- [ ] Cultural contextualization</w:t>
-      </w:r>
-      <w:r>
-        <w:t xml:space="preserve"> </w:t>
-      </w:r>
-      <w:r>
-        <w:t xml:space="preserve">- [ ] Feedback incorporation</w:t>
-      </w:r>
-      <w:r>
-        <w:t xml:space="preserve"> </w:t>
-      </w:r>
-      <w:r>
-        <w:t xml:space="preserve">- [ ] Prompt restructuring</w:t>
-      </w:r>
-      <w:r>
-        <w:t xml:space="preserve"> </w:t>
-      </w:r>
-      <w:r>
-        <w:t xml:space="preserve">- [ ] Length modification</w:t>
-      </w:r>
-    </w:p>
-    <w:p>
-      <w:pPr>
-        <w:pStyle w:val="BodyText"/>
-      </w:pPr>
-      <w:r>
-        <w:rPr>
-          <w:b/>
-          <w:bCs/>
-        </w:rPr>
-        <w:t xml:space="preserve">Audio File:</w:t>
-      </w:r>
-      <w:r>
-        <w:t xml:space="preserve"> </w:t>
-      </w:r>
-      <w:r>
-        <w:rPr>
           <w:rStyle w:val="VerbatimChar"/>
         </w:rPr>
         <w:t xml:space="preserve">SongB_Round3.mp3</w:t>
       </w:r>
     </w:p>
-    <w:bookmarkEnd w:id="39"/>
-    <w:bookmarkStart w:id="40" w:name="harmonic-rubric-song-b-round-3"/>
+    <w:bookmarkEnd w:id="49"/>
+    <w:bookmarkStart w:id="50" w:name="harmonic-rubric-song-b-round-3"/>
     <w:p>
       <w:pPr>
         <w:pStyle w:val="Heading4"/>
@@ -15470,16 +16028,36 @@
         <w:t xml:space="preserve">Composite Score: _____ / 100</w:t>
       </w:r>
     </w:p>
-    <w:p>
-      <w:pPr>
-        <w:pStyle w:val="BodyText"/>
+    <w:bookmarkEnd w:id="50"/>
+    <w:bookmarkStart w:id="51" w:name="song-evaluation-5"/>
+    <w:p>
+      <w:pPr>
+        <w:pStyle w:val="Heading4"/>
+      </w:pPr>
+      <w:r>
+        <w:t xml:space="preserve">Song Evaluation</w:t>
+      </w:r>
+    </w:p>
+    <w:p>
+      <w:pPr>
+        <w:pStyle w:val="FirstParagraph"/>
       </w:pPr>
       <w:r>
         <w:rPr>
           <w:b/>
           <w:bCs/>
         </w:rPr>
-        <w:t xml:space="preserve">Strengths:</w:t>
+        <w:t xml:space="preserve">Song Strengths</w:t>
+      </w:r>
+      <w:r>
+        <w:t xml:space="preserve"> </w:t>
+      </w:r>
+      <w:r>
+        <w:rPr>
+          <w:i/>
+          <w:iCs/>
+        </w:rPr>
+        <w:t xml:space="preserve">(What sounds good? Cite specific musical moments):</w:t>
       </w:r>
     </w:p>
     <w:p>
@@ -15498,7 +16076,17 @@
           <w:b/>
           <w:bCs/>
         </w:rPr>
-        <w:t xml:space="preserve">Weaknesses:</w:t>
+        <w:t xml:space="preserve">Song Weaknesses</w:t>
+      </w:r>
+      <w:r>
+        <w:t xml:space="preserve"> </w:t>
+      </w:r>
+      <w:r>
+        <w:rPr>
+          <w:i/>
+          <w:iCs/>
+        </w:rPr>
+        <w:t xml:space="preserve">(What sounds wrong or weak? Cite specific musical problems):</w:t>
       </w:r>
     </w:p>
     <w:p>
@@ -15517,7 +16105,7 @@
           <w:b/>
           <w:bCs/>
         </w:rPr>
-        <w:t xml:space="preserve">What Improved from Round 2:</w:t>
+        <w:t xml:space="preserve">What improved in the song from Round 2:</w:t>
       </w:r>
     </w:p>
     <w:p>
@@ -15527,6 +16115,38 @@
         </w:pict>
       </w:r>
     </w:p>
+    <w:bookmarkEnd w:id="51"/>
+    <w:bookmarkStart w:id="52" w:name="prompt-evaluation-5"/>
+    <w:p>
+      <w:pPr>
+        <w:pStyle w:val="Heading4"/>
+      </w:pPr>
+      <w:r>
+        <w:t xml:space="preserve">Prompt Evaluation</w:t>
+      </w:r>
+    </w:p>
+    <w:p>
+      <w:pPr>
+        <w:pStyle w:val="FirstParagraph"/>
+      </w:pPr>
+      <w:r>
+        <w:rPr>
+          <w:b/>
+          <w:bCs/>
+        </w:rPr>
+        <w:t xml:space="preserve">What worked in the prompt</w:t>
+      </w:r>
+      <w:r>
+        <w:t xml:space="preserve"> </w:t>
+      </w:r>
+      <w:r>
+        <w:rPr>
+          <w:i/>
+          <w:iCs/>
+        </w:rPr>
+        <w:t xml:space="preserve">(Which keywords/phrases produced the results you wanted?):</w:t>
+      </w:r>
+    </w:p>
     <w:p>
       <w:r>
         <w:pict>
@@ -15534,9 +16154,45 @@
         </w:pict>
       </w:r>
     </w:p>
-    <w:bookmarkEnd w:id="40"/>
-    <w:bookmarkEnd w:id="41"/>
-    <w:bookmarkStart w:id="42" w:name="song-b-score-trajectory"/>
+    <w:p>
+      <w:pPr>
+        <w:pStyle w:val="FirstParagraph"/>
+      </w:pPr>
+      <w:r>
+        <w:rPr>
+          <w:b/>
+          <w:bCs/>
+        </w:rPr>
+        <w:t xml:space="preserve">What didn’t work in the prompt</w:t>
+      </w:r>
+      <w:r>
+        <w:t xml:space="preserve"> </w:t>
+      </w:r>
+      <w:r>
+        <w:rPr>
+          <w:i/>
+          <w:iCs/>
+        </w:rPr>
+        <w:t xml:space="preserve">(Which keywords/phrases were ignored, misinterpreted, or had no effect?):</w:t>
+      </w:r>
+    </w:p>
+    <w:p>
+      <w:r>
+        <w:pict>
+          <v:rect style="width:0;height:1.5pt" o:hralign="center" o:hrstd="t" o:hr="t"/>
+        </w:pict>
+      </w:r>
+    </w:p>
+    <w:p>
+      <w:r>
+        <w:pict>
+          <v:rect style="width:0;height:1.5pt" o:hralign="center" o:hrstd="t" o:hr="t"/>
+        </w:pict>
+      </w:r>
+    </w:p>
+    <w:bookmarkEnd w:id="52"/>
+    <w:bookmarkEnd w:id="53"/>
+    <w:bookmarkStart w:id="54" w:name="song-b-score-trajectory"/>
     <w:p>
       <w:pPr>
         <w:pStyle w:val="Heading3"/>
@@ -15885,9 +16541,9 @@
         </w:pict>
       </w:r>
     </w:p>
-    <w:bookmarkEnd w:id="42"/>
-    <w:bookmarkEnd w:id="43"/>
-    <w:bookmarkStart w:id="48" w:name="summary-report"/>
+    <w:bookmarkEnd w:id="54"/>
+    <w:bookmarkEnd w:id="55"/>
+    <w:bookmarkStart w:id="60" w:name="summary-report"/>
     <w:p>
       <w:pPr>
         <w:pStyle w:val="Heading2"/>
@@ -15896,7 +16552,7 @@
         <w:t xml:space="preserve">4. Summary Report</w:t>
       </w:r>
     </w:p>
-    <w:bookmarkStart w:id="44" w:name="a.-overall-impressions"/>
+    <w:bookmarkStart w:id="56" w:name="a.-overall-impressions"/>
     <w:p>
       <w:pPr>
         <w:pStyle w:val="Heading3"/>
@@ -15924,8 +16580,8 @@
         </w:pict>
       </w:r>
     </w:p>
-    <w:bookmarkEnd w:id="44"/>
-    <w:bookmarkStart w:id="45" w:name="b.-prompt-engineering-strategies"/>
+    <w:bookmarkEnd w:id="56"/>
+    <w:bookmarkStart w:id="57" w:name="b.-prompt-engineering-strategies"/>
     <w:p>
       <w:pPr>
         <w:pStyle w:val="Heading3"/>
@@ -15953,8 +16609,8 @@
         </w:pict>
       </w:r>
     </w:p>
-    <w:bookmarkEnd w:id="45"/>
-    <w:bookmarkStart w:id="46" w:name="c.-quality-trajectory"/>
+    <w:bookmarkEnd w:id="57"/>
+    <w:bookmarkStart w:id="58" w:name="c.-quality-trajectory"/>
     <w:p>
       <w:pPr>
         <w:pStyle w:val="Heading3"/>
@@ -15982,8 +16638,8 @@
         </w:pict>
       </w:r>
     </w:p>
-    <w:bookmarkEnd w:id="46"/>
-    <w:bookmarkStart w:id="47" w:name="d.-big-questions"/>
+    <w:bookmarkEnd w:id="58"/>
+    <w:bookmarkStart w:id="59" w:name="d.-big-questions"/>
     <w:p>
       <w:pPr>
         <w:pStyle w:val="Heading3"/>
@@ -16018,9 +16674,9 @@
         </w:pict>
       </w:r>
     </w:p>
-    <w:bookmarkEnd w:id="47"/>
-    <w:bookmarkEnd w:id="48"/>
-    <w:bookmarkStart w:id="49" w:name="submission-checklist-final-verification"/>
+    <w:bookmarkEnd w:id="59"/>
+    <w:bookmarkEnd w:id="60"/>
+    <w:bookmarkStart w:id="61" w:name="submission-checklist-final-verification"/>
     <w:p>
       <w:pPr>
         <w:pStyle w:val="Heading2"/>
@@ -16153,8 +16809,8 @@
         <w:t xml:space="preserve">SongB_Round3.mp3</w:t>
       </w:r>
     </w:p>
-    <w:bookmarkEnd w:id="49"/>
-    <w:bookmarkEnd w:id="50"/>
+    <w:bookmarkEnd w:id="61"/>
+    <w:bookmarkEnd w:id="62"/>
     <w:sectPr>
       <w:footnotePr>
         <w:numRestart w:val="eachSect"/>

</xml_diff>